<commit_message>
AJAC: set retainer $3,000 and add d/b/a George Brazil
- Retainer amount set to $3,000
- Client identified as AJAC, Inc. d/b/a George Brazil (cover, recipient
  block, opening, and response line)
- Confirmed: Marc Erpenbeck, President; FYE December 31, 2026

Co-Authored-By: Claude Opus 4.8 <noreply@anthropic.com>
Claude-Session: https://claude.ai/code/session_01RfN2m1kgBo1xCWLXRNw2zV
</commit_message>
<xml_diff>
--- a/Onyx_Engagement_Letter_AJAC_HOURLY.docx
+++ b/Onyx_Engagement_Letter_AJAC_HOURLY.docx
@@ -197,7 +197,7 @@
           <w:noProof/>
           <w:color w:val="auto"/>
         </w:rPr>
-        <w:t>AJAC, Inc.</w:t>
+        <w:t>AJAC, Inc. d/b/a George Brazil</w:t>
       </w:r>
       <w:bookmarkEnd w:id="0"/>
     </w:p>
@@ -389,7 +389,7 @@
         <w:rPr>
           <w:noProof/>
         </w:rPr>
-        <w:t>AJAC, Inc.</w:t>
+        <w:t>AJAC, Inc. d/b/a George Brazil</w:t>
       </w:r>
       <w:bookmarkEnd w:id="2"/>
     </w:p>
@@ -491,7 +491,7 @@
         <w:rPr>
           <w:noProof/>
         </w:rPr>
-        <w:t>AJAC, Inc.</w:t>
+        <w:t>AJAC, Inc. d/b/a George Brazil</w:t>
       </w:r>
       <w:r>
         <w:t xml:space="preserve"> (“</w:t>
@@ -1975,7 +1975,7 @@
         <w:rPr>
           <w:noProof/>
         </w:rPr>
-        <w:t>[insert amount]</w:t>
+        <w:t>3,000</w:t>
       </w:r>
       <w:r>
         <w:rPr>
@@ -3802,7 +3802,7 @@
         <w:rPr>
           <w:noProof/>
         </w:rPr>
-        <w:t>AJAC, Inc.</w:t>
+        <w:t>AJAC, Inc. d/b/a George Brazil</w:t>
       </w:r>
       <w:r>
         <w:t>.</w:t>

</xml_diff>

<commit_message>
AJAC: refine scope per additional notes (CFO gone, train/review, systems)
- CFO has now departed; reframed as immediate coverage and continuity
- ONYX trains and reviews the in-house accountant who runs the day-to-day
  (reframed that tier to support-and-training)
- Initial priorities now include: immediate coverage + filing the ready
  tax return, 401(k) plan audit due Oct 15, and training the in-house staff
- Named the systems to integrate: ServiceTitan (field/POS), QStock
  Inventory (integrates with Sage Intacct), and Sage Intacct; inventory
  project references the QStock setup
- CFO tier adds CFO-level reporting/direction to the team and support for
  the planned S-corporation conversion in 2028

Co-Authored-By: Claude Opus 4.8 <noreply@anthropic.com>
Claude-Session: https://claude.ai/code/session_01RfN2m1kgBo1xCWLXRNw2zV
</commit_message>
<xml_diff>
--- a/Onyx_Engagement_Letter_AJAC_HOURLY.docx
+++ b/Onyx_Engagement_Letter_AJAC_HOURLY.docx
@@ -671,7 +671,7 @@
         <w:jc w:val="both"/>
       </w:pPr>
       <w:r>
-        <w:t>ONYX steps in to provide controller-led finance continuity as your CFO transitions out, keeping the monthly close, bank reporting, and day-to-day accounting on track while we tighten the systems and processes behind them. We work inside Sage Intacct alongside your team, follow a perform-and-review approach so the person doing the work is never the one reviewing it, and scale our involvement up or down as the finance function is rebuilt. The services below are illustrative of what ONYX provides and are not a fixed or exhaustive list; we tailor the mix to the Company’s needs and adjust it as those needs change.</w:t>
+        <w:t>ONYX steps in to provide controller-led finance continuity now that your CFO has departed, keeping the monthly close, bank reporting, and day-to-day accounting on track while we support and train your in-house accountant and tighten the systems and processes behind the numbers. We work inside Sage Intacct alongside your team, follow a perform-and-review approach so the person doing the work is never the one reviewing it, and scale our involvement up or down as the finance function is rebuilt. The services below are illustrative of what ONYX provides and are not a fixed or exhaustive list; we tailor the mix to the Company’s needs and adjust it as those needs change.</w:t>
       </w:r>
     </w:p>
     <w:p>
@@ -699,7 +699,7 @@
       </w:pPr>
       <w:r>
         <w:rPr/>
-        <w:t>Assist with the monthly close and review the supporting schedules and reconciliations so the books are accurate and complete.</w:t>
+        <w:t>Provide immediate coverage for the finance function after the CFO’s departure, including getting the completed tax return filed.</w:t>
       </w:r>
     </w:p>
     <w:p>
@@ -713,7 +713,7 @@
       </w:pPr>
       <w:r>
         <w:rPr/>
-        <w:t>Make sure everything is in place to deliver timely, accurate reporting to Bell Bank and to management.</w:t>
+        <w:t>Support the 401(k) plan audit due October 15.</w:t>
       </w:r>
     </w:p>
     <w:p>
@@ -727,7 +727,7 @@
       </w:pPr>
       <w:r>
         <w:rPr/>
-        <w:t>Streamline accounts payable, including evaluating and implementing Bill.com or optimizing AP within Sage Intacct.</w:t>
+        <w:t>Train and support your in-house accountant and review the day-to-day work.</w:t>
       </w:r>
     </w:p>
     <w:p>
@@ -741,7 +741,7 @@
       </w:pPr>
       <w:r>
         <w:rPr/>
-        <w:t>Simplify the general ledger and chart of accounts so reporting is cleaner and easier to maintain.</w:t>
+        <w:t>Assist with the monthly close and review the supporting schedules and reconciliations so the books are accurate and complete.</w:t>
       </w:r>
     </w:p>
     <w:p>
@@ -755,7 +755,7 @@
       </w:pPr>
       <w:r>
         <w:rPr/>
-        <w:t>Reduce the manual work and bottlenecks between systems (Sage Intacct, payroll and HR, and the benefit portals).</w:t>
+        <w:t>Make sure everything is in place to deliver timely, accurate reporting to Bell Bank and to management.</w:t>
       </w:r>
     </w:p>
     <w:p>
@@ -769,7 +769,7 @@
       </w:pPr>
       <w:r>
         <w:rPr/>
-        <w:t>Assist with the inventory project.</w:t>
+        <w:t>Streamline accounts payable, including evaluating and implementing Bill.com or optimizing AP within Sage Intacct.</w:t>
       </w:r>
     </w:p>
     <w:p>
@@ -783,7 +783,49 @@
       </w:pPr>
       <w:r>
         <w:rPr/>
-        <w:t>Support weekly payroll and benefit submissions as needed during the transition.</w:t>
+        <w:t>Simplify the general ledger and chart of accounts so reporting is cleaner and easier to maintain.</w:t>
+      </w:r>
+    </w:p>
+    <w:p>
+      <w:pPr>
+        <w:pStyle w:val="CLALTRNormal"/>
+        <w:numPr>
+          <w:ilvl w:val="0"/>
+          <w:numId w:val="9"/>
+        </w:numPr>
+        <w:jc w:val="both"/>
+      </w:pPr>
+      <w:r>
+        <w:rPr/>
+        <w:t>Reduce the manual work and bottlenecks between ServiceTitan, QStock Inventory, and Sage Intacct so information flows cleanly from the field and inventory into the general ledger.</w:t>
+      </w:r>
+    </w:p>
+    <w:p>
+      <w:pPr>
+        <w:pStyle w:val="CLALTRNormal"/>
+        <w:numPr>
+          <w:ilvl w:val="0"/>
+          <w:numId w:val="9"/>
+        </w:numPr>
+        <w:jc w:val="both"/>
+      </w:pPr>
+      <w:r>
+        <w:rPr/>
+        <w:t>Assist with the inventory project, including the QStock Inventory setup and its integration with Sage Intacct.</w:t>
+      </w:r>
+    </w:p>
+    <w:p>
+      <w:pPr>
+        <w:pStyle w:val="CLALTRNormal"/>
+        <w:numPr>
+          <w:ilvl w:val="0"/>
+          <w:numId w:val="9"/>
+        </w:numPr>
+        <w:jc w:val="both"/>
+      </w:pPr>
+      <w:r>
+        <w:rPr/>
+        <w:t>Support weekly payroll and benefit submissions as needed.</w:t>
       </w:r>
     </w:p>
     <w:p>
@@ -811,17 +853,17 @@
       </w:pPr>
       <w:r>
         <w:rPr/>
-        <w:t xml:space="preserve">Day-to-day accounting operations</w:t>
-      </w:r>
-    </w:p>
-    <w:p>
-      <w:pPr>
-        <w:pStyle w:val="CLALTRNormal"/>
-        <w:jc w:val="both"/>
-      </w:pPr>
-      <w:r>
-        <w:rPr/>
-        <w:t xml:space="preserve">Our team handles the recurring transaction work that keeps the books accurate, current, and close-ready:</w:t>
+        <w:t>Support and training for your in-house accounting</w:t>
+      </w:r>
+    </w:p>
+    <w:p>
+      <w:pPr>
+        <w:pStyle w:val="CLALTRNormal"/>
+        <w:jc w:val="both"/>
+      </w:pPr>
+      <w:r>
+        <w:rPr/>
+        <w:t>Your in-house accountant runs the day-to-day. ONYX provides the training, review, and backup to keep it accurate and consistent:</w:t>
       </w:r>
     </w:p>
     <w:p>
@@ -835,7 +877,7 @@
       </w:pPr>
       <w:r>
         <w:rPr/>
-        <w:t>Support accounts payable, including vendor bills, the check run, and positive-pay reporting, and help move the process onto a more automated platform.</w:t>
+        <w:t>Review and support accounts payable, including the check run and positive-pay reporting, and help move the process onto a more automated platform.</w:t>
       </w:r>
     </w:p>
     <w:p>
@@ -849,7 +891,7 @@
       </w:pPr>
       <w:r>
         <w:rPr/>
-        <w:t>Support accounts receivable and collections, including customer billing, cash receipts, and remote deposits.</w:t>
+        <w:t>Review and support accounts receivable and collections, including customer billing, cash receipts, and remote deposits.</w:t>
       </w:r>
     </w:p>
     <w:p>
@@ -863,7 +905,7 @@
       </w:pPr>
       <w:r>
         <w:rPr/>
-        <w:t>Reconcile bank, credit-card, and loan accounts and post journal entries each month, keeping the books clean and close-ready.</w:t>
+        <w:t>Review the monthly bank, credit-card, and loan reconciliations and the supporting journal entries.</w:t>
       </w:r>
     </w:p>
     <w:p>
@@ -877,7 +919,7 @@
       </w:pPr>
       <w:r>
         <w:rPr/>
-        <w:t xml:space="preserve">Maintain depreciation schedules</w:t>
+        <w:t>Review and maintain depreciation schedules.</w:t>
       </w:r>
     </w:p>
     <w:p>
@@ -891,7 +933,7 @@
       </w:pPr>
       <w:r>
         <w:rPr/>
-        <w:t>Maintain job-costing and inventory records and support the related month-end entries.</w:t>
+        <w:t>Support job-costing and inventory records and the related month-end entries.</w:t>
       </w:r>
     </w:p>
     <w:p>
@@ -929,7 +971,7 @@
       </w:pPr>
       <w:r>
         <w:rPr/>
-        <w:t xml:space="preserve">Review and approve the reconciliations and journal entries our staff prepare, adding a second layer of accuracy and control</w:t>
+        <w:t>Review and approve the reconciliations and journal entries prepared by your in-house team, adding a second layer of accuracy and control</w:t>
       </w:r>
     </w:p>
     <w:p>
@@ -1135,7 +1177,21 @@
       </w:pPr>
       <w:r>
         <w:rPr/>
-        <w:t>Help rebuild and stabilize the finance function after the CFO transition, and provide periodic strategic discussions with ownership as questions arise.</w:t>
+        <w:t>Provide CFO-level reporting and strategic direction to the finance team, and help rebuild and stabilize the function after the CFO’s departure.</w:t>
+      </w:r>
+    </w:p>
+    <w:p>
+      <w:pPr>
+        <w:pStyle w:val="CLALTRNormal"/>
+        <w:numPr>
+          <w:ilvl w:val="0"/>
+          <w:numId w:val="10"/>
+        </w:numPr>
+        <w:jc w:val="both"/>
+      </w:pPr>
+      <w:r>
+        <w:rPr/>
+        <w:t>Support the Company’s planned conversion back to an S corporation in 2028.</w:t>
       </w:r>
     </w:p>
     <w:p>

</xml_diff>

<commit_message>
AJAC: clarify ONYX does not do tax work or file returns
- Reworded the immediate-coverage priority so ONYX gets the books and
  information to the Company's tax preparer, who files (ONYX does not file)
- Added explicit statement at the tax bullet: ONYX does not prepare or file
  tax returns; the Company's tax preparer handles all tax filings

Co-Authored-By: Claude Opus 4.8 <noreply@anthropic.com>
Claude-Session: https://claude.ai/code/session_01RfN2m1kgBo1xCWLXRNw2zV
</commit_message>
<xml_diff>
--- a/Onyx_Engagement_Letter_AJAC_HOURLY.docx
+++ b/Onyx_Engagement_Letter_AJAC_HOURLY.docx
@@ -699,7 +699,7 @@
       </w:pPr>
       <w:r>
         <w:rPr/>
-        <w:t>Provide immediate coverage for the finance function after the CFO’s departure, including getting the completed tax return filed.</w:t>
+        <w:t>Provide immediate coverage for the finance function after the CFO’s departure, and get the books and information to the Company’s tax preparer so the completed return can be filed.</w:t>
       </w:r>
     </w:p>
     <w:p>
@@ -1083,7 +1083,7 @@
       </w:pPr>
       <w:r>
         <w:rPr/>
-        <w:t>Gather and organize everything the Company’s tax preparer and auditor need for the annual return and audit.</w:t>
+        <w:t>Gather and organize everything the Company’s tax preparer and auditor need for the annual return and audit. ONYX does not prepare or file tax returns; the Company’s tax preparer handles all tax filings.</w:t>
       </w:r>
     </w:p>
     <w:p>

</xml_diff>

<commit_message>
AJAC: fix doubled 'the', standardize dba, unbold opening clause
- Removed duplicate 'the' in the termination sentence ('with the books
  and supporting schedules')
- Standardized entity reference to 'dba' throughout (recipient block and
  response line were 'd/b/a')
- Unbolded the evergreen clause in the opening paragraph
- Adopts the client-reviewed version (merged tiers, CFO $275, trimmed
  cover and add-ons)

Co-Authored-By: Claude Opus 4.8 <noreply@anthropic.com>
Claude-Session: https://claude.ai/code/session_01RfN2m1kgBo1xCWLXRNw2zV
</commit_message>
<xml_diff>
--- a/Onyx_Engagement_Letter_AJAC_HOURLY.docx
+++ b/Onyx_Engagement_Letter_AJAC_HOURLY.docx
@@ -161,7 +161,19 @@
         <w:rPr>
           <w:noProof/>
         </w:rPr>
-        <w:t>October 2, 2026</w:t>
+        <w:t xml:space="preserve">October </w:t>
+      </w:r>
+      <w:r>
+        <w:rPr>
+          <w:noProof/>
+        </w:rPr>
+        <w:t>5</w:t>
+      </w:r>
+      <w:r>
+        <w:rPr>
+          <w:noProof/>
+        </w:rPr>
+        <w:t>, 2026</w:t>
       </w:r>
     </w:p>
     <w:p>
@@ -172,11 +184,11 @@
         </w:rPr>
       </w:pPr>
       <w:r>
-        <w:t xml:space="preserve">Engagement Proposal &amp; Agreement</w:t>
+        <w:t>Engagement Proposal &amp; Agreement</w:t>
       </w:r>
       <w:r>
         <w:br/>
-        <w:t xml:space="preserve">Prepared exclusively for</w:t>
+        <w:t>Prepared exclusively for</w:t>
       </w:r>
     </w:p>
     <w:p>
@@ -187,84 +199,31 @@
         </w:rPr>
       </w:pPr>
       <w:bookmarkStart w:id="0" w:name="Text1"/>
-      <w:r>
-        <w:rPr>
-          <w:color w:val="auto"/>
-        </w:rPr>
-      </w:r>
       <w:r>
         <w:rPr>
           <w:noProof/>
           <w:color w:val="auto"/>
         </w:rPr>
-        <w:t>AJAC, Inc. d/b/a George Brazil</w:t>
+        <w:t>AJAC, Inc. dba George Brazil</w:t>
       </w:r>
       <w:bookmarkEnd w:id="0"/>
     </w:p>
     <w:p>
       <w:pPr>
         <w:pStyle w:val="CLAProNormalNoSpaceAfter"/>
-        <w:ind w:left="4140" w:hanging="4590"/>
-      </w:pPr>
-      <w:r>
+        <w:ind w:left="4140" w:hanging="360"/>
         <w:rPr>
           <w:i/>
         </w:rPr>
-        <w:t>The accounting department your business deserves</w:t>
-      </w:r>
-    </w:p>
-    <w:p>
-      <w:pPr>
-        <w:pStyle w:val="CLAProNormalNoSpaceAfter"/>
-        <w:ind w:left="4140" w:hanging="4590"/>
-      </w:pPr>
-      <w:r>
-        <w:rPr>
-          <w:i/>
-        </w:rPr>
-        <w:t>— without the cost and overhead of building one in-house.</w:t>
-      </w:r>
-    </w:p>
-    <w:p>
-      <w:pPr>
-        <w:pStyle w:val="CLAProNormalNoSpaceAfter"/>
-        <w:ind w:left="4140" w:hanging="4590"/>
-      </w:pPr>
-      <w:r>
-        <w:t>·   Controller-led finance continuity</w:t>
-      </w:r>
-    </w:p>
-    <w:p>
-      <w:pPr>
-        <w:pStyle w:val="CLAProNormalNoSpaceAfter"/>
-        <w:ind w:left="4140" w:hanging="4590"/>
-      </w:pPr>
-      <w:r>
-        <w:t>·   Month-end close &amp; bank reporting</w:t>
-      </w:r>
-    </w:p>
-    <w:p>
-      <w:pPr>
-        <w:pStyle w:val="CLAProNormalNoSpaceAfter"/>
-        <w:ind w:left="4140" w:hanging="4590"/>
-      </w:pPr>
-      <w:r>
-        <w:t>·   AP, GL &amp; systems optimization</w:t>
-      </w:r>
-    </w:p>
-    <w:p>
-      <w:pPr>
-        <w:pStyle w:val="CLAProNormalNoSpaceAfter"/>
-        <w:ind w:left="4140" w:hanging="4590"/>
-      </w:pPr>
-      <w:r>
-        <w:t>·   Fractional CFO support</w:t>
-      </w:r>
+      </w:pPr>
     </w:p>
     <w:p>
       <w:pPr>
         <w:pStyle w:val="CLAProNormalNoSpaceAfter"/>
         <w:ind w:left="4140"/>
+        <w:rPr>
+          <w:i/>
+        </w:rPr>
       </w:pPr>
     </w:p>
     <w:p>
@@ -355,11 +314,6 @@
     <w:p>
       <w:pPr>
         <w:pStyle w:val="CLAProNormal"/>
-      </w:pPr>
-    </w:p>
-    <w:p>
-      <w:pPr>
-        <w:pStyle w:val="CLAProNormal"/>
         <w:sectPr>
           <w:type w:val="continuous"/>
           <w:pgSz w:w="12240" w:h="15840"/>
@@ -378,7 +332,20 @@
         <w:rPr>
           <w:noProof/>
         </w:rPr>
-        <w:t>October 2, 2026</w:t>
+        <w:lastRenderedPageBreak/>
+        <w:t xml:space="preserve">October </w:t>
+      </w:r>
+      <w:r>
+        <w:rPr>
+          <w:noProof/>
+        </w:rPr>
+        <w:t>5</w:t>
+      </w:r>
+      <w:r>
+        <w:rPr>
+          <w:noProof/>
+        </w:rPr>
+        <w:t>, 2026</w:t>
       </w:r>
     </w:p>
     <w:p>
@@ -389,163 +356,161 @@
         <w:rPr>
           <w:noProof/>
         </w:rPr>
-        <w:t>AJAC, Inc. d/b/a George Brazil</w:t>
-      </w:r>
+        <w:t>AJAC, Inc. dba George Brazil</w:t>
+      </w:r>
+    </w:p>
+    <w:p>
+      <w:pPr>
+        <w:pStyle w:val="CLALTRAddressorSignature"/>
+      </w:pPr>
+      <w:r>
+        <w:t>Attn: Marc Erpenbeck, President</w:t>
+      </w:r>
+    </w:p>
+    <w:p>
+      <w:pPr>
+        <w:pStyle w:val="CLALTRAddressorSignature"/>
+      </w:pPr>
+      <w:r>
+        <w:t>3830 S 38th St</w:t>
+      </w:r>
+      <w:bookmarkStart w:id="1" w:name="Text11"/>
+      <w:bookmarkEnd w:id="1"/>
+    </w:p>
+    <w:p>
+      <w:pPr>
+        <w:pStyle w:val="CLALTRAddressorSignature"/>
+      </w:pPr>
+      <w:r>
+        <w:t>Phoenix, AZ 85040</w:t>
+      </w:r>
+      <w:bookmarkStart w:id="2" w:name="Text12"/>
       <w:bookmarkEnd w:id="2"/>
     </w:p>
     <w:p>
       <w:pPr>
         <w:pStyle w:val="CLALTRAddressorSignature"/>
       </w:pPr>
-      <w:r>
-        <w:t>Attn: Marc Erpenbeck, President</w:t>
-      </w:r>
-      <w:bookmarkEnd w:id="2"/>
-    </w:p>
-    <w:p>
-      <w:pPr>
-        <w:pStyle w:val="CLALTRAddressorSignature"/>
-      </w:pPr>
-      <w:r>
-        <w:t>3830 S 38th St</w:t>
-      </w:r>
-      <w:bookmarkStart w:id="3" w:name="Text11"/>
+    </w:p>
+    <w:p>
+      <w:pPr>
+        <w:pStyle w:val="CLALTRNormal"/>
+      </w:pPr>
+      <w:r>
+        <w:t xml:space="preserve">Dear </w:t>
+      </w:r>
+      <w:bookmarkStart w:id="3" w:name="Text22"/>
+      <w:r>
+        <w:rPr>
+          <w:noProof/>
+        </w:rPr>
+        <w:t>Marc</w:t>
+      </w:r>
       <w:bookmarkEnd w:id="3"/>
-    </w:p>
-    <w:p>
-      <w:pPr>
-        <w:pStyle w:val="CLALTRAddressorSignature"/>
-      </w:pPr>
-      <w:r>
-        <w:t>Phoenix, AZ 85040</w:t>
-      </w:r>
-      <w:bookmarkStart w:id="4" w:name="Text12"/>
+      <w:r>
+        <w:t>:</w:t>
+      </w:r>
+    </w:p>
+    <w:p>
+      <w:pPr>
+        <w:pStyle w:val="CLALTRNormal"/>
+        <w:jc w:val="both"/>
+      </w:pPr>
+      <w:r>
+        <w:t>We appreciate your decision to retain Onyx Accounting Group, LLC (“ONYX”</w:t>
+      </w:r>
+      <w:r>
+        <w:t xml:space="preserve">, “we”, </w:t>
+      </w:r>
+      <w:r>
+        <w:t>and/or “us” – as the context requires</w:t>
+      </w:r>
+      <w:r>
+        <w:t xml:space="preserve">). </w:t>
+      </w:r>
+      <w:r>
+        <w:t xml:space="preserve">This letter </w:t>
+      </w:r>
+      <w:r>
+        <w:t xml:space="preserve">states </w:t>
+      </w:r>
+      <w:r>
+        <w:t xml:space="preserve">the terms and objectives of </w:t>
+      </w:r>
+      <w:r>
+        <w:t>ONYX’s</w:t>
+      </w:r>
+      <w:r>
+        <w:t xml:space="preserve"> </w:t>
+      </w:r>
+      <w:r>
+        <w:t xml:space="preserve">engagement and the nature and limitations of the services </w:t>
+      </w:r>
+      <w:r>
+        <w:t>Onyx</w:t>
+      </w:r>
+      <w:r>
+        <w:t xml:space="preserve"> will provide for </w:t>
+      </w:r>
+      <w:r>
+        <w:rPr>
+          <w:noProof/>
+        </w:rPr>
+        <w:t>AJAC, Inc. dba George Brazil</w:t>
+      </w:r>
+      <w:r>
+        <w:t xml:space="preserve"> (“</w:t>
+      </w:r>
+      <w:r>
+        <w:t>the Client</w:t>
+      </w:r>
+      <w:r>
+        <w:t>”</w:t>
+      </w:r>
+      <w:r>
+        <w:t xml:space="preserve">, “you”, and/or “your” – as </w:t>
+      </w:r>
+      <w:r>
+        <w:t>the context requires</w:t>
+      </w:r>
+      <w:r>
+        <w:t xml:space="preserve">) </w:t>
+      </w:r>
+      <w:r>
+        <w:t xml:space="preserve">starting in </w:t>
+      </w:r>
+      <w:r>
+        <w:rPr>
+          <w:noProof/>
+        </w:rPr>
+        <w:t>2026</w:t>
+      </w:r>
+      <w:r>
+        <w:t xml:space="preserve"> </w:t>
+      </w:r>
+      <w:r>
+        <w:t>for the</w:t>
+      </w:r>
+      <w:r>
+        <w:t xml:space="preserve"> fiscal year</w:t>
+      </w:r>
+      <w:r>
+        <w:t xml:space="preserve"> end</w:t>
+      </w:r>
+      <w:r>
+        <w:t>ing</w:t>
+      </w:r>
+      <w:r>
+        <w:t xml:space="preserve"> </w:t>
+      </w:r>
+      <w:bookmarkStart w:id="4" w:name="Text47"/>
+      <w:r>
+        <w:rPr>
+          <w:noProof/>
+        </w:rPr>
+        <w:t>December 31, 2026</w:t>
+      </w:r>
       <w:bookmarkEnd w:id="4"/>
-    </w:p>
-    <w:p>
-      <w:pPr>
-        <w:pStyle w:val="CLALTRAddressorSignature"/>
-      </w:pPr>
-    </w:p>
-    <w:p>
-      <w:pPr>
-        <w:pStyle w:val="CLALTRNormal"/>
-      </w:pPr>
-      <w:r>
-        <w:t xml:space="preserve">Dear </w:t>
-      </w:r>
-      <w:bookmarkStart w:id="5" w:name="Text22"/>
-      <w:r>
-        <w:rPr>
-          <w:noProof/>
-        </w:rPr>
-        <w:t>Marc</w:t>
-      </w:r>
-      <w:bookmarkEnd w:id="5"/>
-      <w:r>
-        <w:t>:</w:t>
-      </w:r>
-    </w:p>
-    <w:p>
-      <w:pPr>
-        <w:pStyle w:val="CLALTRNormal"/>
-        <w:jc w:val="both"/>
-      </w:pPr>
-      <w:r>
-        <w:t>We appreciate your decision to retain Onyx Accounting Group, LLC (“ONYX”</w:t>
-      </w:r>
-      <w:r>
-        <w:t xml:space="preserve">, “we”, </w:t>
-      </w:r>
-      <w:r>
-        <w:t>and/or “us” – as the context requires</w:t>
-      </w:r>
-      <w:r>
-        <w:t xml:space="preserve">). </w:t>
-      </w:r>
-      <w:r>
-        <w:t xml:space="preserve">This letter </w:t>
-      </w:r>
-      <w:r>
-        <w:t xml:space="preserve">states </w:t>
-      </w:r>
-      <w:r>
-        <w:t xml:space="preserve">the terms and objectives of </w:t>
-      </w:r>
-      <w:r>
-        <w:t>ONYX’s</w:t>
-      </w:r>
-      <w:r>
-        <w:t xml:space="preserve"> </w:t>
-      </w:r>
-      <w:r>
-        <w:t xml:space="preserve">engagement and the nature and limitations of the services </w:t>
-      </w:r>
-      <w:r>
-        <w:t>Onyx</w:t>
-      </w:r>
-      <w:r>
-        <w:t xml:space="preserve"> will provide for </w:t>
-      </w:r>
-      <w:r>
-        <w:rPr>
-          <w:noProof/>
-        </w:rPr>
-        <w:t>AJAC, Inc. d/b/a George Brazil</w:t>
-      </w:r>
-      <w:r>
-        <w:t xml:space="preserve"> (“</w:t>
-      </w:r>
-      <w:r>
-        <w:t>the Client</w:t>
-      </w:r>
-      <w:r>
-        <w:t>”</w:t>
-      </w:r>
-      <w:r>
-        <w:t xml:space="preserve">, “you”, and/or “your” – as </w:t>
-      </w:r>
-      <w:r>
-        <w:t>the context requires</w:t>
-      </w:r>
-      <w:r>
-        <w:t xml:space="preserve">) </w:t>
-      </w:r>
-      <w:r>
-        <w:t xml:space="preserve">starting in </w:t>
-      </w:r>
-      <w:r>
-        <w:rPr>
-          <w:noProof/>
-        </w:rPr>
-        <w:t>2026</w:t>
-      </w:r>
-      <w:r>
-        <w:t xml:space="preserve"> </w:t>
-      </w:r>
-      <w:r>
-        <w:t>for the</w:t>
-      </w:r>
-      <w:r>
-        <w:t xml:space="preserve"> fiscal year</w:t>
-      </w:r>
-      <w:r>
-        <w:t xml:space="preserve"> end</w:t>
-      </w:r>
-      <w:r>
-        <w:t>ing</w:t>
-      </w:r>
-      <w:r>
-        <w:t xml:space="preserve"> </w:t>
-      </w:r>
-      <w:bookmarkStart w:id="6" w:name="Text47"/>
-      <w:r>
-        <w:rPr>
-          <w:noProof/>
-        </w:rPr>
-        <w:t>December 31, 2026</w:t>
-      </w:r>
-      <w:bookmarkEnd w:id="6"/>
       <w:r>
         <w:t xml:space="preserve"> (the “Initial Period”)</w:t>
       </w:r>
@@ -554,79 +519,79 @@
       </w:r>
       <w:r>
         <w:rPr>
-          <w:b/>
+          <w:b w:val="0"/>
         </w:rPr>
         <w:t xml:space="preserve">will apply to the </w:t>
       </w:r>
       <w:r>
         <w:rPr>
-          <w:b/>
+          <w:b w:val="0"/>
         </w:rPr>
         <w:t>I</w:t>
       </w:r>
       <w:r>
         <w:rPr>
-          <w:b/>
+          <w:b w:val="0"/>
         </w:rPr>
         <w:t>nitial</w:t>
       </w:r>
       <w:r>
         <w:rPr>
-          <w:b/>
+          <w:b w:val="0"/>
         </w:rPr>
         <w:t xml:space="preserve"> Period</w:t>
       </w:r>
       <w:r>
         <w:rPr>
-          <w:b/>
+          <w:b w:val="0"/>
         </w:rPr>
         <w:t>,</w:t>
       </w:r>
       <w:r>
         <w:rPr>
-          <w:b/>
+          <w:b w:val="0"/>
         </w:rPr>
         <w:t xml:space="preserve"> and all subsequent </w:t>
       </w:r>
       <w:r>
         <w:rPr>
-          <w:b/>
+          <w:b w:val="0"/>
         </w:rPr>
         <w:t>periods</w:t>
       </w:r>
       <w:r>
         <w:rPr>
-          <w:b/>
+          <w:b w:val="0"/>
         </w:rPr>
         <w:t xml:space="preserve">, unless the </w:t>
       </w:r>
       <w:r>
         <w:rPr>
-          <w:b/>
+          <w:b w:val="0"/>
         </w:rPr>
         <w:t>terms of our engagement are</w:t>
       </w:r>
       <w:r>
         <w:rPr>
-          <w:b/>
+          <w:b w:val="0"/>
         </w:rPr>
         <w:t xml:space="preserve"> changed in a </w:t>
       </w:r>
       <w:r>
         <w:rPr>
-          <w:b/>
+          <w:b w:val="0"/>
         </w:rPr>
         <w:t xml:space="preserve">written </w:t>
       </w:r>
       <w:r>
         <w:rPr>
-          <w:b/>
+          <w:b w:val="0"/>
         </w:rPr>
         <w:t xml:space="preserve">communication </w:t>
       </w:r>
       <w:r>
         <w:rPr>
-          <w:b/>
+          <w:b w:val="0"/>
         </w:rPr>
         <w:t>including by email, agreed to by both ONYX and the Client</w:t>
       </w:r>
@@ -648,11 +613,11 @@
         <w:rPr>
           <w:caps/>
           <w:color w:val="7F7F7F"/>
+          <w:spacing w:val="60"/>
           <w:sz w:val="18"/>
           <w:szCs w:val="18"/>
-          <w:spacing w:val="60"/>
-        </w:rPr>
-        <w:t xml:space="preserve">Section 1</w:t>
+        </w:rPr>
+        <w:t>Section 1</w:t>
       </w:r>
       <w:r>
         <w:br/>
@@ -662,7 +627,7 @@
           <w:sz w:val="48"/>
           <w:szCs w:val="48"/>
         </w:rPr>
-        <w:t xml:space="preserve">What we’ll do for you</w:t>
+        <w:t>What we’ll do for you</w:t>
       </w:r>
     </w:p>
     <w:p>
@@ -677,15 +642,26 @@
     <w:p>
       <w:pPr>
         <w:pStyle w:val="CLALTRNormal"/>
-        <w:numPr>
-          <w:ilvl w:val="0"/>
-          <w:numId w:val="8"/>
-        </w:numPr>
-        <w:jc w:val="both"/>
-      </w:pPr>
-      <w:r>
-        <w:rPr/>
+        <w:ind w:left="270" w:hanging="270"/>
+        <w:jc w:val="both"/>
+        <w:rPr>
+          <w:b/>
+          <w:bCs/>
+        </w:rPr>
+      </w:pPr>
+      <w:r>
+        <w:rPr>
+          <w:b/>
+          <w:bCs/>
+        </w:rPr>
         <w:t>Initial priorities</w:t>
+      </w:r>
+      <w:r>
+        <w:rPr>
+          <w:b/>
+          <w:bCs/>
+        </w:rPr>
+        <w:t>:</w:t>
       </w:r>
     </w:p>
     <w:p>
@@ -698,8 +674,13 @@
         <w:jc w:val="both"/>
       </w:pPr>
       <w:r>
-        <w:rPr/>
-        <w:t>Provide immediate coverage for the finance function after the CFO’s departure, and get the books and information to the Company’s tax preparer so the completed return can be filed.</w:t>
+        <w:t xml:space="preserve">Provide immediate coverage for the finance function after the CFO’s </w:t>
+      </w:r>
+      <w:r>
+        <w:t>departure and</w:t>
+      </w:r>
+      <w:r>
+        <w:t xml:space="preserve"> get the books and information to the Company’s tax preparer so the completed return can be filed.</w:t>
       </w:r>
     </w:p>
     <w:p>
@@ -712,7 +693,6 @@
         <w:jc w:val="both"/>
       </w:pPr>
       <w:r>
-        <w:rPr/>
         <w:t>Support the 401(k) plan audit due October 15.</w:t>
       </w:r>
     </w:p>
@@ -726,7 +706,6 @@
         <w:jc w:val="both"/>
       </w:pPr>
       <w:r>
-        <w:rPr/>
         <w:t>Train and support your in-house accountant and review the day-to-day work.</w:t>
       </w:r>
     </w:p>
@@ -740,8 +719,10 @@
         <w:jc w:val="both"/>
       </w:pPr>
       <w:r>
-        <w:rPr/>
-        <w:t>Assist with the monthly close and review the supporting schedules and reconciliations so the books are accurate and complete.</w:t>
+        <w:t>Drive</w:t>
+      </w:r>
+      <w:r>
+        <w:t xml:space="preserve"> the monthly close and review the supporting schedules and reconciliations so the books are accurate and complete.</w:t>
       </w:r>
     </w:p>
     <w:p>
@@ -754,8 +735,22 @@
         <w:jc w:val="both"/>
       </w:pPr>
       <w:r>
-        <w:rPr/>
-        <w:t>Make sure everything is in place to deliver timely, accurate reporting to Bell Bank and to management.</w:t>
+        <w:t xml:space="preserve">Make sure everything is in place to deliver timely, accurate reporting to </w:t>
+      </w:r>
+      <w:r>
+        <w:t>management</w:t>
+      </w:r>
+      <w:r>
+        <w:t xml:space="preserve"> </w:t>
+      </w:r>
+      <w:r>
+        <w:t xml:space="preserve">and </w:t>
+      </w:r>
+      <w:r>
+        <w:t>Bell Bank</w:t>
+      </w:r>
+      <w:r>
+        <w:t>.</w:t>
       </w:r>
     </w:p>
     <w:p>
@@ -768,7 +763,6 @@
         <w:jc w:val="both"/>
       </w:pPr>
       <w:r>
-        <w:rPr/>
         <w:t>Streamline accounts payable, including evaluating and implementing Bill.com or optimizing AP within Sage Intacct.</w:t>
       </w:r>
     </w:p>
@@ -782,8 +776,8 @@
         <w:jc w:val="both"/>
       </w:pPr>
       <w:r>
-        <w:rPr/>
-        <w:t>Simplify the general ledger and chart of accounts so reporting is cleaner and easier to maintain.</w:t>
+        <w:lastRenderedPageBreak/>
+        <w:t>Reduce the manual work and bottlenecks between ServiceTitan, QStock Inventory, and Sage Intacct so information flows cleanly from the field and inventory into the general ledger.</w:t>
       </w:r>
     </w:p>
     <w:p>
@@ -796,8 +790,7 @@
         <w:jc w:val="both"/>
       </w:pPr>
       <w:r>
-        <w:rPr/>
-        <w:t>Reduce the manual work and bottlenecks between ServiceTitan, QStock Inventory, and Sage Intacct so information flows cleanly from the field and inventory into the general ledger.</w:t>
+        <w:t>Assist with the inventory project, including the QStock Inventory setup and its integration with Sage Intacct.</w:t>
       </w:r>
     </w:p>
     <w:p>
@@ -810,8 +803,35 @@
         <w:jc w:val="both"/>
       </w:pPr>
       <w:r>
-        <w:rPr/>
-        <w:t>Assist with the inventory project, including the QStock Inventory setup and its integration with Sage Intacct.</w:t>
+        <w:t>Support weekly payroll and benefit submissions as needed.</w:t>
+      </w:r>
+    </w:p>
+    <w:p>
+      <w:pPr>
+        <w:pStyle w:val="CLALTRHeading2"/>
+        <w:spacing w:line="360" w:lineRule="auto"/>
+        <w:jc w:val="both"/>
+      </w:pPr>
+      <w:r>
+        <w:t>Ongoing normal accounting services:</w:t>
+      </w:r>
+    </w:p>
+    <w:p>
+      <w:pPr>
+        <w:pStyle w:val="CLALTRNormal"/>
+        <w:jc w:val="both"/>
+      </w:pPr>
+      <w:r>
+        <w:t>Controller-level oversight and reporting</w:t>
+      </w:r>
+      <w:r>
+        <w:t xml:space="preserve">. </w:t>
+      </w:r>
+      <w:r>
+        <w:t>Y</w:t>
+      </w:r>
+      <w:r>
+        <w:t>our in-house accountant runs the day-to-day. ONYX provides the training, review, and backup to keep it accurate and consistent:</w:t>
       </w:r>
     </w:p>
     <w:p>
@@ -824,46 +844,7 @@
         <w:jc w:val="both"/>
       </w:pPr>
       <w:r>
-        <w:rPr/>
-        <w:t>Support weekly payroll and benefit submissions as needed.</w:t>
-      </w:r>
-    </w:p>
-    <w:p>
-      <w:pPr>
-        <w:pStyle w:val="CLALTRHeading2"/>
-        <w:jc w:val="both"/>
-      </w:pPr>
-      <w:proofErr w:type="gramStart"/>
-      <w:r>
-        <w:t>Ongoing</w:t>
-      </w:r>
-      <w:proofErr w:type="gramEnd"/>
-      <w:r>
-        <w:t xml:space="preserve"> normal accounting services:</w:t>
-      </w:r>
-    </w:p>
-    <w:p>
-      <w:pPr>
-        <w:pStyle w:val="CLALTRNormal"/>
-        <w:numPr>
-          <w:ilvl w:val="0"/>
-          <w:numId w:val="8"/>
-        </w:numPr>
-        <w:jc w:val="both"/>
-      </w:pPr>
-      <w:r>
-        <w:rPr/>
-        <w:t>Support and training for your in-house accounting</w:t>
-      </w:r>
-    </w:p>
-    <w:p>
-      <w:pPr>
-        <w:pStyle w:val="CLALTRNormal"/>
-        <w:jc w:val="both"/>
-      </w:pPr>
-      <w:r>
-        <w:rPr/>
-        <w:t>Your in-house accountant runs the day-to-day. ONYX provides the training, review, and backup to keep it accurate and consistent:</w:t>
+        <w:t>Review and support accounts payable, including the check run and positive-pay reporting, and help move the process onto a more automated platform.</w:t>
       </w:r>
     </w:p>
     <w:p>
@@ -876,8 +857,7 @@
         <w:jc w:val="both"/>
       </w:pPr>
       <w:r>
-        <w:rPr/>
-        <w:t>Review and support accounts payable, including the check run and positive-pay reporting, and help move the process onto a more automated platform.</w:t>
+        <w:t>Review and support accounts receivable and collections, including customer billing, cash receipts, and remote deposits.</w:t>
       </w:r>
     </w:p>
     <w:p>
@@ -890,8 +870,7 @@
         <w:jc w:val="both"/>
       </w:pPr>
       <w:r>
-        <w:rPr/>
-        <w:t>Review and support accounts receivable and collections, including customer billing, cash receipts, and remote deposits.</w:t>
+        <w:t>Review the monthly bank, credit-card, and loan reconciliations and the supporting journal entries.</w:t>
       </w:r>
     </w:p>
     <w:p>
@@ -904,8 +883,7 @@
         <w:jc w:val="both"/>
       </w:pPr>
       <w:r>
-        <w:rPr/>
-        <w:t>Review the monthly bank, credit-card, and loan reconciliations and the supporting journal entries.</w:t>
+        <w:t>Review and maintain depreciation schedules.</w:t>
       </w:r>
     </w:p>
     <w:p>
@@ -918,46 +896,16 @@
         <w:jc w:val="both"/>
       </w:pPr>
       <w:r>
-        <w:rPr/>
-        <w:t>Review and maintain depreciation schedules.</w:t>
-      </w:r>
-    </w:p>
-    <w:p>
-      <w:pPr>
-        <w:pStyle w:val="CLALTRNormal"/>
-        <w:numPr>
-          <w:ilvl w:val="0"/>
-          <w:numId w:val="9"/>
-        </w:numPr>
-        <w:jc w:val="both"/>
-      </w:pPr>
-      <w:r>
-        <w:rPr/>
         <w:t>Support job-costing and inventory records and the related month-end entries.</w:t>
       </w:r>
     </w:p>
     <w:p>
       <w:pPr>
         <w:pStyle w:val="CLALTRNormal"/>
-        <w:numPr>
-          <w:ilvl w:val="0"/>
-          <w:numId w:val="8"/>
-        </w:numPr>
-        <w:jc w:val="both"/>
-      </w:pPr>
-      <w:r>
-        <w:rPr/>
-        <w:t xml:space="preserve">Controller-level oversight and reporting</w:t>
-      </w:r>
-    </w:p>
-    <w:p>
-      <w:pPr>
-        <w:pStyle w:val="CLALTRNormal"/>
-        <w:jc w:val="both"/>
-      </w:pPr>
-      <w:r>
-        <w:rPr/>
-        <w:t xml:space="preserve">A second layer of review and reporting that turns clean books into insight, so management always has accurate, timely numbers to act on:</w:t>
+        <w:jc w:val="both"/>
+      </w:pPr>
+      <w:r>
+        <w:t>A second layer of review and reporting that turns clean books into insight, so management always has accurate, timely numbers to act on:</w:t>
       </w:r>
     </w:p>
     <w:p>
@@ -970,7 +918,6 @@
         <w:jc w:val="both"/>
       </w:pPr>
       <w:r>
-        <w:rPr/>
         <w:t>Review and approve the reconciliations and journal entries prepared by your in-house team, adding a second layer of accuracy and control</w:t>
       </w:r>
     </w:p>
@@ -984,8 +931,7 @@
         <w:jc w:val="both"/>
       </w:pPr>
       <w:r>
-        <w:rPr/>
-        <w:t xml:space="preserve">Reconcile complex accounts and prepare the related journal entries</w:t>
+        <w:t>Reconcile complex accounts and prepare the related journal entries</w:t>
       </w:r>
     </w:p>
     <w:p>
@@ -998,7 +944,6 @@
         <w:jc w:val="both"/>
       </w:pPr>
       <w:r>
-        <w:rPr/>
         <w:t>Own the monthly close and produce departmental and management reporting in the format the Company uses.</w:t>
       </w:r>
     </w:p>
@@ -1012,8 +957,7 @@
         <w:jc w:val="both"/>
       </w:pPr>
       <w:r>
-        <w:rPr/>
-        <w:t xml:space="preserve">Develop and track the key business metrics that matter most to the Client, and review them with management on a regular basis</w:t>
+        <w:t>Develop and track the key business metrics that matter most to the Client, and review them with management on a regular basis</w:t>
       </w:r>
     </w:p>
     <w:p>
@@ -1026,8 +970,7 @@
         <w:jc w:val="both"/>
       </w:pPr>
       <w:r>
-        <w:rPr/>
-        <w:t xml:space="preserve">Document the Client’s accounting processes and procedures</w:t>
+        <w:t>Document the Client’s accounting processes and procedures</w:t>
       </w:r>
     </w:p>
     <w:p>
@@ -1040,7 +983,6 @@
         <w:jc w:val="both"/>
       </w:pPr>
       <w:r>
-        <w:rPr/>
         <w:t>Simplify the general ledger and chart of accounts, and strengthen the processes and controls behind the close.</w:t>
       </w:r>
     </w:p>
@@ -1054,8 +996,7 @@
         <w:jc w:val="both"/>
       </w:pPr>
       <w:r>
-        <w:rPr/>
-        <w:t xml:space="preserve">Monitor and manage cash flow so the Client always knows what’s coming in and going out</w:t>
+        <w:t>Monitor and manage cash flow so the Client always knows what’s coming in and going out</w:t>
       </w:r>
     </w:p>
     <w:p>
@@ -1068,7 +1009,7 @@
         <w:jc w:val="both"/>
       </w:pPr>
       <w:r>
-        <w:rPr/>
+        <w:lastRenderedPageBreak/>
         <w:t>Prepare the quarterly reporting Bell Bank requires, and assist with bank communications and routine information requests.</w:t>
       </w:r>
     </w:p>
@@ -1082,32 +1023,33 @@
         <w:jc w:val="both"/>
       </w:pPr>
       <w:r>
-        <w:rPr/>
         <w:t>Gather and organize everything the Company’s tax preparer and auditor need for the annual return and audit. ONYX does not prepare or file tax returns; the Company’s tax preparer handles all tax filings.</w:t>
       </w:r>
     </w:p>
     <w:p>
       <w:pPr>
         <w:pStyle w:val="CLALTRNormal"/>
-        <w:numPr>
-          <w:ilvl w:val="0"/>
-          <w:numId w:val="8"/>
-        </w:numPr>
-        <w:jc w:val="both"/>
-      </w:pPr>
-      <w:r>
-        <w:rPr/>
-        <w:t xml:space="preserve">CFO-level strategic support</w:t>
-      </w:r>
-    </w:p>
-    <w:p>
-      <w:pPr>
-        <w:pStyle w:val="CLALTRNormal"/>
-        <w:jc w:val="both"/>
-      </w:pPr>
-      <w:r>
-        <w:rPr/>
-        <w:t xml:space="preserve">On an as-needed or as-requested basis, ONYX serves as the Client’s strategic financial partner, providing the guidance, perspective, and forward-looking planning of a CFO without the full-time cost:</w:t>
+        <w:jc w:val="both"/>
+        <w:rPr>
+          <w:b/>
+          <w:bCs/>
+        </w:rPr>
+      </w:pPr>
+      <w:r>
+        <w:rPr>
+          <w:b/>
+          <w:bCs/>
+        </w:rPr>
+        <w:t>CFO-level strategic support</w:t>
+      </w:r>
+    </w:p>
+    <w:p>
+      <w:pPr>
+        <w:pStyle w:val="CLALTRNormal"/>
+        <w:jc w:val="both"/>
+      </w:pPr>
+      <w:r>
+        <w:t>On an as-needed or as-requested basis, ONYX serves as the Client’s strategic financial partner, providing the guidance, perspective, and forward-looking planning of a CFO without the full-time cost:</w:t>
       </w:r>
     </w:p>
     <w:p>
@@ -1120,8 +1062,7 @@
         <w:jc w:val="both"/>
       </w:pPr>
       <w:r>
-        <w:rPr/>
-        <w:t xml:space="preserve">Serve as a strategic financial partner to ownership and management, offering guidance and direction across the finance function</w:t>
+        <w:t>Serve as a strategic financial partner to ownership and management, offering guidance and direction across the finance function</w:t>
       </w:r>
     </w:p>
     <w:p>
@@ -1134,8 +1075,7 @@
         <w:jc w:val="both"/>
       </w:pPr>
       <w:r>
-        <w:rPr/>
-        <w:t xml:space="preserve">Advise on financial reporting structure, management reporting, and accounting policy</w:t>
+        <w:t>Advise on financial reporting structure, management reporting, and accounting policy</w:t>
       </w:r>
     </w:p>
     <w:p>
@@ -1148,8 +1088,7 @@
         <w:jc w:val="both"/>
       </w:pPr>
       <w:r>
-        <w:rPr/>
-        <w:t xml:space="preserve">Lead budgeting, forecasting, and long-term financial modeling to support growth and scenario planning</w:t>
+        <w:t>Lead budgeting, forecasting, and long-term financial modeling to support growth and scenario planning</w:t>
       </w:r>
     </w:p>
     <w:p>
@@ -1162,7 +1101,6 @@
         <w:jc w:val="both"/>
       </w:pPr>
       <w:r>
-        <w:rPr/>
         <w:t>Support financing and banking relationships, including lender and covenant reporting and negotiations.</w:t>
       </w:r>
     </w:p>
@@ -1176,7 +1114,6 @@
         <w:jc w:val="both"/>
       </w:pPr>
       <w:r>
-        <w:rPr/>
         <w:t>Provide CFO-level reporting and strategic direction to the finance team, and help rebuild and stabilize the function after the CFO’s departure.</w:t>
       </w:r>
     </w:p>
@@ -1190,100 +1127,45 @@
         <w:jc w:val="both"/>
       </w:pPr>
       <w:r>
-        <w:rPr/>
         <w:t>Support the Company’s planned conversion back to an S corporation in 2028.</w:t>
       </w:r>
     </w:p>
     <w:p>
       <w:pPr>
-        <w:pStyle w:val="CLALTRNormal"/>
-        <w:numPr>
-          <w:ilvl w:val="0"/>
-          <w:numId w:val="8"/>
-        </w:numPr>
-        <w:jc w:val="both"/>
-      </w:pPr>
-      <w:r>
-        <w:t xml:space="preserve">The following additional services are available and, when engaged, are described in the attached addendum(s):</w:t>
-      </w:r>
-    </w:p>
-    <w:p>
-      <w:pPr>
-        <w:pStyle w:val="CLALTRNormal"/>
-        <w:numPr>
-          <w:ilvl w:val="0"/>
-          <w:numId w:val="11"/>
-        </w:numPr>
-        <w:jc w:val="both"/>
-      </w:pPr>
-      <w:r>
-        <w:rPr/>
-        <w:t xml:space="preserve">Payroll preparation</w:t>
-      </w:r>
-    </w:p>
-    <w:p>
-      <w:pPr>
-        <w:pStyle w:val="CLALTRNormal"/>
-        <w:numPr>
-          <w:ilvl w:val="0"/>
-          <w:numId w:val="11"/>
-        </w:numPr>
-        <w:jc w:val="both"/>
-      </w:pPr>
-      <w:r>
-        <w:rPr/>
-        <w:t xml:space="preserve">Sage Intacct implementation and support</w:t>
-      </w:r>
-    </w:p>
-    <w:p>
-      <w:pPr>
-        <w:pStyle w:val="CLALTRNormal"/>
-        <w:numPr>
-          <w:ilvl w:val="0"/>
-          <w:numId w:val="11"/>
-        </w:numPr>
-        <w:jc w:val="both"/>
-      </w:pPr>
-      <w:r>
-        <w:rPr/>
-        <w:t xml:space="preserve">Human resources</w:t>
-      </w:r>
-    </w:p>
-    <w:p>
-      <w:pPr>
         <w:pStyle w:val="CLALTRHeading2"/>
         <w:jc w:val="both"/>
       </w:pPr>
       <w:r>
-        <w:t xml:space="preserve">Adjusting your services as your needs change</w:t>
-      </w:r>
-    </w:p>
-    <w:p>
-      <w:pPr>
-        <w:pStyle w:val="CLALTRNormal"/>
-        <w:jc w:val="both"/>
-      </w:pPr>
-      <w:r>
-        <w:t>Your needs will evolve as your business grows, and this engagement is built to flex with them. Services can be added, reduced, or adjusted at any time by mutual written agreement, including by email, with no formal addendum or new engagement letter required. All other terms of this agreement remain in effect, so adding or removing a service never requires starting over.</w:t>
+        <w:t>Adjusting your services as your needs change</w:t>
+      </w:r>
+    </w:p>
+    <w:p>
+      <w:pPr>
+        <w:pStyle w:val="CLALTRNormal"/>
+        <w:jc w:val="both"/>
+      </w:pPr>
+      <w:r>
+        <w:t>Your needs will evolve as your business grows, and this engagement is built to flex with them. Services can be added, reduced, or adjusted at any time by mutual written agreement, including by email, with no formal addendum or new engagement letter required. All other terms of this agreement remain in effect</w:t>
+      </w:r>
+      <w:r>
+        <w:t>.</w:t>
       </w:r>
     </w:p>
     <w:p>
       <w:pPr>
         <w:pStyle w:val="CLALTRHeading1"/>
         <w:jc w:val="both"/>
-        <w:rPr/>
-      </w:pPr>
-      <w:r>
-        <w:t xml:space="preserve">How we’ll work together</w:t>
-      </w:r>
-    </w:p>
-    <w:p>
-      <w:pPr>
-        <w:pStyle w:val="CLALTRNormal"/>
-        <w:jc w:val="both"/>
-      </w:pPr>
-      <w:r>
-        <w:rPr/>
+      </w:pPr>
+      <w:r>
+        <w:t>How we’ll work together</w:t>
+      </w:r>
+    </w:p>
+    <w:p>
+      <w:pPr>
+        <w:pStyle w:val="CLALTRNormal"/>
+        <w:jc w:val="both"/>
+      </w:pPr>
+      <w:r>
         <w:t>Because ONYX works from the access and records the Company provides and does not have authority to move funds, a few responsibilities stay with the Company. All approvals should be documented in writing, whether electronically or manually:</w:t>
       </w:r>
     </w:p>
@@ -1295,10 +1177,8 @@
           <w:numId w:val="21"/>
         </w:numPr>
         <w:jc w:val="both"/>
-        <w:rPr/>
-      </w:pPr>
-      <w:r>
-        <w:rPr/>
+      </w:pPr>
+      <w:r>
         <w:t>Provide ONYX with access to Sage Intacct and view access to bank, credit-card, and loan accounts, plus the reports and records needed to do the work.</w:t>
       </w:r>
     </w:p>
@@ -1310,10 +1190,8 @@
           <w:numId w:val="21"/>
         </w:numPr>
         <w:jc w:val="both"/>
-        <w:rPr/>
-      </w:pPr>
-      <w:r>
-        <w:rPr/>
+      </w:pPr>
+      <w:r>
         <w:t>Provide timely, accurate information and a primary point of contact, and keep the internal accounting staff available to support the work.</w:t>
       </w:r>
     </w:p>
@@ -1325,10 +1203,8 @@
           <w:numId w:val="21"/>
         </w:numPr>
         <w:jc w:val="both"/>
-        <w:rPr/>
-      </w:pPr>
-      <w:r>
-        <w:rPr/>
+      </w:pPr>
+      <w:r>
         <w:t>Retain approval authority over the Company’s own transactions, including invoices and payments, new vendors and customers, and payroll, and approve any payments ONYX is engaged to process.</w:t>
       </w:r>
     </w:p>
@@ -1340,10 +1216,9 @@
           <w:numId w:val="21"/>
         </w:numPr>
         <w:jc w:val="both"/>
-        <w:rPr/>
-      </w:pPr>
-      <w:r>
-        <w:rPr/>
+      </w:pPr>
+      <w:r>
+        <w:lastRenderedPageBreak/>
         <w:t>Review and approve (or delegate to the ONYX controller) bank, credit-card, and loan reconciliations.</w:t>
       </w:r>
     </w:p>
@@ -1355,10 +1230,8 @@
           <w:numId w:val="21"/>
         </w:numPr>
         <w:jc w:val="both"/>
-        <w:rPr/>
-      </w:pPr>
-      <w:r>
-        <w:rPr/>
+      </w:pPr>
+      <w:r>
         <w:t>Maintain responsibility for tax filings and for meeting the Company’s legal, lender, benefit-plan, and audit obligations.</w:t>
       </w:r>
     </w:p>
@@ -1368,7 +1241,7 @@
         <w:jc w:val="both"/>
       </w:pPr>
       <w:r>
-        <w:t xml:space="preserve">Fees &amp; billing</w:t>
+        <w:t>Fees &amp; billing</w:t>
       </w:r>
     </w:p>
     <w:p>
@@ -1399,46 +1272,29 @@
         <w:jc w:val="both"/>
       </w:pPr>
       <w:r>
-        <w:rPr/>
         <w:t>Services performed by Staff Accountant</w:t>
       </w:r>
       <w:r>
-        <w:rPr/>
         <w:tab/>
       </w:r>
       <w:r>
-        <w:rPr/>
         <w:tab/>
       </w:r>
       <w:r>
-        <w:rPr/>
         <w:tab/>
       </w:r>
       <w:r>
-        <w:rPr/>
         <w:tab/>
       </w:r>
       <w:r>
-        <w:rPr/>
         <w:tab/>
       </w:r>
       <w:r>
-        <w:rPr/>
         <w:tab/>
       </w:r>
       <w:r>
-        <w:rPr/>
         <w:tab/>
-      </w:r>
-      <w:proofErr w:type="gramStart"/>
-      <w:r>
-        <w:rPr/>
-        <w:t>$100</w:t>
-      </w:r>
-      <w:proofErr w:type="gramEnd"/>
-      <w:r>
-        <w:rPr/>
-        <w:t xml:space="preserve"> per hour</w:t>
+        <w:t>$100 per hour</w:t>
       </w:r>
     </w:p>
     <w:p>
@@ -1451,32 +1307,30 @@
         <w:jc w:val="both"/>
       </w:pPr>
       <w:r>
-        <w:rPr/>
         <w:t>Services performed by Controller</w:t>
       </w:r>
       <w:r>
-        <w:rPr/>
         <w:tab/>
       </w:r>
       <w:r>
-        <w:rPr/>
         <w:tab/>
       </w:r>
       <w:r>
-        <w:rPr/>
         <w:tab/>
       </w:r>
       <w:r>
-        <w:rPr/>
         <w:tab/>
       </w:r>
       <w:r>
-        <w:rPr/>
         <w:tab/>
       </w:r>
       <w:r>
-        <w:rPr/>
         <w:tab/>
+      </w:r>
+      <w:r>
+        <w:tab/>
+      </w:r>
+      <w:r>
         <w:t>$185 per hour</w:t>
       </w:r>
     </w:p>
@@ -1490,7 +1344,6 @@
         <w:jc w:val="both"/>
       </w:pPr>
       <w:r>
-        <w:rPr/>
         <w:t xml:space="preserve">Services performed by </w:t>
       </w:r>
       <w:r>
@@ -1500,84 +1353,81 @@
         <w:t>CFO</w:t>
       </w:r>
       <w:r>
-        <w:rPr/>
-        <w:t/>
-      </w:r>
-      <w:r>
-        <w:rPr/>
         <w:tab/>
       </w:r>
       <w:r>
-        <w:rPr/>
         <w:tab/>
       </w:r>
       <w:r>
-        <w:rPr/>
         <w:tab/>
-        <w:t>$250 per hour</w:t>
-      </w:r>
-    </w:p>
-    <w:p>
-      <w:pPr>
-        <w:pStyle w:val="CLALTRNormal"/>
-        <w:jc w:val="both"/>
-      </w:pPr>
-      <w:proofErr w:type="gramStart"/>
-      <w:r>
-        <w:rPr/>
-        <w:t>Subsequent to</w:t>
-      </w:r>
-      <w:proofErr w:type="gramEnd"/>
-      <w:r>
-        <w:rPr/>
-        <w:t xml:space="preserve"> the billing rate guarantee date, the rates </w:t>
-      </w:r>
-      <w:r>
-        <w:rPr/>
+      </w:r>
+      <w:r>
+        <w:tab/>
+      </w:r>
+      <w:r>
+        <w:tab/>
+      </w:r>
+      <w:r>
+        <w:tab/>
+      </w:r>
+      <w:r>
+        <w:tab/>
+      </w:r>
+      <w:r>
+        <w:tab/>
+      </w:r>
+      <w:r>
+        <w:t>$2</w:t>
+      </w:r>
+      <w:r>
+        <w:t>75</w:t>
+      </w:r>
+      <w:r>
+        <w:t xml:space="preserve"> per hour</w:t>
+      </w:r>
+    </w:p>
+    <w:p>
+      <w:pPr>
+        <w:pStyle w:val="CLALTRNormal"/>
+        <w:jc w:val="both"/>
+      </w:pPr>
+      <w:r>
+        <w:t xml:space="preserve">Subsequent to the billing rate guarantee date, the rates </w:t>
+      </w:r>
+      <w:r>
         <w:t>may be adjusted</w:t>
       </w:r>
       <w:r>
-        <w:rPr/>
         <w:t xml:space="preserve"> only</w:t>
       </w:r>
       <w:r>
-        <w:rPr/>
         <w:t xml:space="preserve"> as </w:t>
       </w:r>
       <w:r>
-        <w:rPr/>
         <w:t>agreed</w:t>
       </w:r>
       <w:r>
-        <w:rPr/>
         <w:t xml:space="preserve"> in writing</w:t>
       </w:r>
       <w:r>
-        <w:rPr/>
         <w:t xml:space="preserve"> between </w:t>
       </w:r>
       <w:r>
-        <w:rPr/>
         <w:t xml:space="preserve">the Client </w:t>
       </w:r>
       <w:r>
-        <w:rPr/>
         <w:t xml:space="preserve">and </w:t>
       </w:r>
       <w:r>
-        <w:rPr/>
         <w:t>ONYX</w:t>
       </w:r>
       <w:r>
-        <w:rPr/>
         <w:t xml:space="preserve"> </w:t>
       </w:r>
       <w:r>
-        <w:rPr/>
         <w:t>through an addendum to this engagement letter</w:t>
       </w:r>
       <w:r>
-        <w:rPr/>
         <w:t>.</w:t>
       </w:r>
     </w:p>
@@ -1613,8 +1463,13 @@
         <w:jc w:val="both"/>
       </w:pPr>
       <w:r>
-        <w:rPr/>
-        <w:t>Billed hourly as incurred. ONYX will review the books and systems first, then provide a written scope and ballpark estimate before significant project work begins, with regular progress-and-budget updates so there are no surprises.</w:t>
+        <w:t>Billed hourly as incurred. ONYX will</w:t>
+      </w:r>
+      <w:r>
+        <w:t xml:space="preserve"> </w:t>
+      </w:r>
+      <w:r>
+        <w:t>provide regular progress-and-budget updates so there are no surprises.</w:t>
       </w:r>
     </w:p>
     <w:p>
@@ -1626,7 +1481,6 @@
           <w:u w:val="single"/>
         </w:rPr>
       </w:pPr>
-      <w:proofErr w:type="gramStart"/>
       <w:r>
         <w:rPr>
           <w:b w:val="0"/>
@@ -1634,7 +1488,6 @@
         </w:rPr>
         <w:t>Ongoing accounting and controller services:</w:t>
       </w:r>
-      <w:proofErr w:type="gramEnd"/>
     </w:p>
     <w:p>
       <w:pPr>
@@ -1646,21 +1499,17 @@
         <w:jc w:val="both"/>
       </w:pPr>
       <w:r>
-        <w:rPr/>
         <w:t>Billed hourly at the rates above, based on the volume and mix of work once the monthly scope is set.</w:t>
       </w:r>
-      <w:proofErr w:type="gramStart"/>
-      <w:proofErr w:type="gramEnd"/>
-      <w:bookmarkStart w:id="7" w:name="Text49"/>
-      <w:bookmarkEnd w:id="7"/>
-    </w:p>
-    <w:p>
-      <w:pPr>
-        <w:pStyle w:val="CLALTRNormal"/>
-        <w:jc w:val="both"/>
-      </w:pPr>
-      <w:r>
-        <w:rPr/>
+      <w:bookmarkStart w:id="5" w:name="Text49"/>
+      <w:bookmarkEnd w:id="5"/>
+    </w:p>
+    <w:p>
+      <w:pPr>
+        <w:pStyle w:val="CLALTRNormal"/>
+        <w:jc w:val="both"/>
+      </w:pPr>
+      <w:r>
         <w:t>Our fees for these services will be based on the time involved and the degree of responsibility and skill required, plus expenses, including internal and administrative charges. These estimates assume timely cooperation from the Company in providing requested records and access; if requested items are not available when needed or are inaccurate, the fee will likely be higher. Should unexpected circumstances require significant additional time, ONYX will advise the Company before undertaking any work that would substantially increase the fee estimate.</w:t>
       </w:r>
     </w:p>
@@ -1670,65 +1519,39 @@
         <w:jc w:val="both"/>
       </w:pPr>
       <w:r>
-        <w:rPr/>
-        <w:t xml:space="preserve"> </w:t>
-      </w:r>
-      <w:proofErr w:type="gramStart"/>
-      <w:r>
-        <w:rPr/>
-        <w:t>During the course of</w:t>
-      </w:r>
-      <w:proofErr w:type="gramEnd"/>
-      <w:r>
-        <w:rPr/>
-        <w:t xml:space="preserve"> our engagement, we may incur o</w:t>
-      </w:r>
-      <w:r>
-        <w:rPr/>
+        <w:t xml:space="preserve"> During the course of our engagement, we may incur o</w:t>
+      </w:r>
+      <w:r>
         <w:t xml:space="preserve">ut-of-pocket </w:t>
       </w:r>
       <w:r>
-        <w:rPr/>
         <w:t xml:space="preserve">costs and </w:t>
       </w:r>
       <w:r>
-        <w:rPr/>
         <w:t>expenses</w:t>
       </w:r>
       <w:r>
-        <w:rPr/>
         <w:t xml:space="preserve"> on your behalf. These costs and </w:t>
       </w:r>
       <w:r>
-        <w:rPr/>
-        <w:t xml:space="preserve">expenses, which you will be responsible </w:t>
-      </w:r>
-      <w:proofErr w:type="gramStart"/>
-      <w:r>
-        <w:rPr/>
-        <w:t>to pay</w:t>
-      </w:r>
-      <w:proofErr w:type="gramEnd"/>
-      <w:r>
-        <w:rPr/>
-        <w:t xml:space="preserve">, include, but are not necessarily limited </w:t>
-      </w:r>
-      <w:proofErr w:type="gramStart"/>
-      <w:r>
-        <w:rPr/>
-        <w:t>to,</w:t>
-      </w:r>
-      <w:proofErr w:type="gramEnd"/>
-      <w:r>
-        <w:rPr/>
-        <w:t xml:space="preserve"> out-of-town travel, meals, and lodging</w:t>
-      </w:r>
-      <w:r>
-        <w:rPr/>
+        <w:t>expenses, which you will be responsible to pay, include, but are not necessarily limited to,</w:t>
+      </w:r>
+      <w:r>
+        <w:t xml:space="preserve"> travel</w:t>
+      </w:r>
+      <w:r>
+        <w:t xml:space="preserve"> time</w:t>
+      </w:r>
+      <w:r>
+        <w:t xml:space="preserve"> and</w:t>
+      </w:r>
+      <w:r>
+        <w:t xml:space="preserve"> meals</w:t>
+      </w:r>
+      <w:r>
         <w:t>. These out-of-pocket costs and expenses</w:t>
       </w:r>
       <w:r>
-        <w:rPr/>
         <w:t xml:space="preserve"> will be billed at cost and are not included in the fees quoted above.</w:t>
       </w:r>
     </w:p>
@@ -1738,11 +1561,7 @@
         <w:jc w:val="both"/>
       </w:pPr>
       <w:r>
-        <w:t xml:space="preserve">Our invoices for these fees will be </w:t>
-      </w:r>
-      <w:proofErr w:type="gramStart"/>
-      <w:r>
-        <w:t xml:space="preserve">rendered </w:t>
+        <w:t xml:space="preserve">Our invoices for these fees will be rendered </w:t>
       </w:r>
       <w:r>
         <w:rPr>
@@ -1750,285 +1569,255 @@
           <w:bCs/>
           <w:u w:val="single"/>
         </w:rPr>
-        <w:t>bi</w:t>
-      </w:r>
-      <w:proofErr w:type="gramEnd"/>
+        <w:t>bi-weekly</w:t>
+      </w:r>
+      <w:r>
+        <w:t xml:space="preserve"> as work progresses and are payable on presentation. </w:t>
+      </w:r>
+      <w:r>
+        <w:t xml:space="preserve">Terms of payment for services are </w:t>
+      </w:r>
+      <w:r>
+        <w:rPr>
+          <w:b/>
+          <w:u w:val="single"/>
+        </w:rPr>
+        <w:t>net</w:t>
+      </w:r>
+      <w:r>
+        <w:rPr>
+          <w:b/>
+          <w:u w:val="single"/>
+        </w:rPr>
+        <w:t xml:space="preserve"> seven</w:t>
+      </w:r>
+      <w:r>
+        <w:rPr>
+          <w:b/>
+          <w:u w:val="single"/>
+        </w:rPr>
+        <w:t xml:space="preserve"> </w:t>
+      </w:r>
+      <w:r>
+        <w:rPr>
+          <w:b/>
+          <w:u w:val="single"/>
+        </w:rPr>
+        <w:t>(</w:t>
+      </w:r>
+      <w:r>
+        <w:rPr>
+          <w:b/>
+          <w:u w:val="single"/>
+        </w:rPr>
+        <w:t>7</w:t>
+      </w:r>
+      <w:r>
+        <w:rPr>
+          <w:b/>
+          <w:u w:val="single"/>
+        </w:rPr>
+        <w:t>)</w:t>
+      </w:r>
+      <w:r>
+        <w:rPr>
+          <w:b/>
+          <w:u w:val="single"/>
+        </w:rPr>
+        <w:t xml:space="preserve"> days</w:t>
+      </w:r>
+      <w:r>
+        <w:t>.</w:t>
+      </w:r>
+      <w:r>
+        <w:t xml:space="preserve"> </w:t>
+      </w:r>
+      <w:r>
+        <w:t xml:space="preserve">In accordance with our firm policies, work may be suspended if </w:t>
+      </w:r>
+      <w:r>
+        <w:t>the Client’s</w:t>
+      </w:r>
+      <w:r>
+        <w:t xml:space="preserve"> </w:t>
+      </w:r>
+      <w:r>
+        <w:t>account becomes</w:t>
+      </w:r>
+      <w:r>
+        <w:t xml:space="preserve"> thirty</w:t>
+      </w:r>
+      <w:r>
+        <w:t xml:space="preserve"> </w:t>
+      </w:r>
+      <w:r>
+        <w:t>(</w:t>
+      </w:r>
+      <w:r>
+        <w:t>30</w:t>
+      </w:r>
+      <w:r>
+        <w:t>)</w:t>
+      </w:r>
+      <w:r>
+        <w:rPr>
+          <w:rStyle w:val="CLALTRHiddenTextChar"/>
+        </w:rPr>
+        <w:t xml:space="preserve"> </w:t>
+      </w:r>
+      <w:r>
+        <w:t xml:space="preserve"> days or more overdue and will not be resumed until </w:t>
+      </w:r>
+      <w:r>
+        <w:t>the Client’s</w:t>
+      </w:r>
+      <w:r>
+        <w:t xml:space="preserve"> </w:t>
+      </w:r>
+      <w:r>
+        <w:t xml:space="preserve">account is paid in full. If </w:t>
+      </w:r>
+      <w:r>
+        <w:t>ONYX</w:t>
+      </w:r>
+      <w:r>
+        <w:t xml:space="preserve"> </w:t>
+      </w:r>
+      <w:r>
+        <w:t>elect</w:t>
+      </w:r>
+      <w:r>
+        <w:t>s</w:t>
+      </w:r>
+      <w:r>
+        <w:t xml:space="preserve"> to terminate </w:t>
+      </w:r>
+      <w:r>
+        <w:t>its</w:t>
+      </w:r>
+      <w:r>
+        <w:t xml:space="preserve"> services for nonpayment, </w:t>
+      </w:r>
+      <w:r>
+        <w:t>ONYX’s</w:t>
+      </w:r>
+      <w:r>
+        <w:t xml:space="preserve"> </w:t>
+      </w:r>
+      <w:r>
+        <w:t xml:space="preserve">engagement will be deemed to have been completed even if </w:t>
+      </w:r>
+      <w:r>
+        <w:t>it has</w:t>
+      </w:r>
+      <w:r>
+        <w:t xml:space="preserve"> not </w:t>
+      </w:r>
+      <w:r>
+        <w:t xml:space="preserve">provided </w:t>
+      </w:r>
+      <w:r>
+        <w:t xml:space="preserve">the Client </w:t>
+      </w:r>
+      <w:r>
+        <w:t xml:space="preserve">with the </w:t>
+      </w:r>
+      <w:r>
+        <w:rPr>
+          <w:noProof/>
+        </w:rPr>
+        <w:t>books and supporting schedules</w:t>
+      </w:r>
+      <w:r>
+        <w:t xml:space="preserve">. </w:t>
+      </w:r>
+      <w:r>
+        <w:t>The Client</w:t>
+      </w:r>
+      <w:r>
+        <w:t xml:space="preserve"> </w:t>
+      </w:r>
+      <w:r>
+        <w:t xml:space="preserve">will be obligated to compensate </w:t>
+      </w:r>
+      <w:r>
+        <w:t>ONYX</w:t>
+      </w:r>
+      <w:r>
+        <w:t xml:space="preserve"> </w:t>
+      </w:r>
+      <w:r>
+        <w:t xml:space="preserve">for all time expended and to reimburse </w:t>
+      </w:r>
+      <w:r>
+        <w:t>ONYX</w:t>
+      </w:r>
+      <w:r>
+        <w:t xml:space="preserve"> </w:t>
+      </w:r>
+      <w:r>
+        <w:t>for all out-of-pocket expenditures through the date of termination.</w:t>
+      </w:r>
+    </w:p>
+    <w:p>
+      <w:pPr>
+        <w:pStyle w:val="CLALTRNormal"/>
+        <w:jc w:val="both"/>
+      </w:pPr>
+      <w:r>
+        <w:t xml:space="preserve">If the Client disputes or questions any charges on </w:t>
+      </w:r>
+      <w:r>
+        <w:t xml:space="preserve">any invoice, then the Client must notify ONYX, IN WRITING, listing the specific time entries or costs on the invoices the Client is disputing within thirty (30) days of the date </w:t>
+      </w:r>
+      <w:r>
+        <w:lastRenderedPageBreak/>
+        <w:t xml:space="preserve">shown on the invoice. If ONYX does not receive written notice of any such dispute or question within thirty (30) days of the date shown on the invoice, then ONYX will understand the Client’s silence to mean that the Client </w:t>
+      </w:r>
+      <w:r>
+        <w:t>finds the billing statement, and all of its itemized charges and costs, acceptable and reasonable.</w:t>
+      </w:r>
+    </w:p>
+    <w:p>
+      <w:pPr>
+        <w:pStyle w:val="CLALTRHeading2"/>
+        <w:jc w:val="both"/>
+      </w:pPr>
+      <w:r>
+        <w:t>Retainer</w:t>
+      </w:r>
+    </w:p>
+    <w:p>
+      <w:pPr>
+        <w:pStyle w:val="CLALTRNormal"/>
+        <w:jc w:val="both"/>
+      </w:pPr>
+      <w:r>
+        <w:t xml:space="preserve">In connection with this engagement, </w:t>
+      </w:r>
+      <w:r>
+        <w:t>ONYX</w:t>
+      </w:r>
+      <w:r>
+        <w:t xml:space="preserve"> </w:t>
+      </w:r>
+      <w:r>
+        <w:t>must receive a retainer in the initial amount of</w:t>
+      </w:r>
+      <w:r>
+        <w:t xml:space="preserve"> </w:t>
+      </w:r>
       <w:r>
         <w:rPr>
           <w:b/>
           <w:bCs/>
-          <w:u w:val="single"/>
-        </w:rPr>
-        <w:t>-weekly</w:t>
-      </w:r>
-      <w:r>
-        <w:t xml:space="preserve"> as work progresses and are payable on presentation. </w:t>
-      </w:r>
-      <w:r>
-        <w:t xml:space="preserve">Terms of payment for services are </w:t>
-      </w:r>
-      <w:proofErr w:type="gramStart"/>
+        </w:rPr>
+        <w:t>$</w:t>
+      </w:r>
       <w:r>
         <w:rPr>
           <w:b/>
-          <w:u w:val="single"/>
-        </w:rPr>
-        <w:t>net</w:t>
-      </w:r>
-      <w:proofErr w:type="gramEnd"/>
-      <w:r>
-        <w:rPr>
-          <w:b/>
-          <w:u w:val="single"/>
-        </w:rPr>
-        <w:t xml:space="preserve"> seven</w:t>
-      </w:r>
-      <w:r>
-        <w:rPr>
-          <w:b/>
-          <w:u w:val="single"/>
-        </w:rPr>
-        <w:t xml:space="preserve"> </w:t>
-      </w:r>
-      <w:r>
-        <w:rPr>
-          <w:b/>
-          <w:u w:val="single"/>
-        </w:rPr>
-        <w:t>(</w:t>
-      </w:r>
-      <w:r>
-        <w:rPr>
-          <w:b/>
-          <w:u w:val="single"/>
-        </w:rPr>
-        <w:t>7</w:t>
-      </w:r>
-      <w:r>
-        <w:rPr>
-          <w:b/>
-          <w:u w:val="single"/>
-        </w:rPr>
-        <w:t>)</w:t>
-      </w:r>
-      <w:r>
-        <w:rPr>
-          <w:b/>
-          <w:u w:val="single"/>
-        </w:rPr>
-        <w:t xml:space="preserve"> days</w:t>
-      </w:r>
-      <w:r>
-        <w:t>.</w:t>
-      </w:r>
-      <w:r>
-        <w:t xml:space="preserve"> </w:t>
-      </w:r>
-      <w:r>
-        <w:t xml:space="preserve">In accordance with our firm policies, work may be suspended if </w:t>
-      </w:r>
-      <w:r>
-        <w:t>the Client’s</w:t>
-      </w:r>
-      <w:r>
-        <w:t xml:space="preserve"> </w:t>
-      </w:r>
-      <w:r>
-        <w:t>account becomes</w:t>
-      </w:r>
-      <w:r>
-        <w:t xml:space="preserve"> thirty</w:t>
-      </w:r>
-      <w:r>
-        <w:t xml:space="preserve"> </w:t>
-      </w:r>
-      <w:r>
-        <w:t>(</w:t>
-      </w:r>
-      <w:r>
-        <w:t>30</w:t>
-      </w:r>
-      <w:r>
-        <w:t>)</w:t>
-      </w:r>
-      <w:r>
-        <w:rPr>
-          <w:rStyle w:val="CLALTRHiddenTextChar"/>
-        </w:rPr>
-        <w:t xml:space="preserve"> </w:t>
-      </w:r>
-      <w:r>
-        <w:t xml:space="preserve"> days or more overdue and will not be resumed until </w:t>
-      </w:r>
-      <w:r>
-        <w:t>the Client’s</w:t>
-      </w:r>
-      <w:r>
-        <w:t xml:space="preserve"> </w:t>
-      </w:r>
-      <w:r>
-        <w:t xml:space="preserve">account is paid in full. If </w:t>
-      </w:r>
-      <w:r>
-        <w:t>ONYX</w:t>
-      </w:r>
-      <w:r>
-        <w:t xml:space="preserve"> </w:t>
-      </w:r>
-      <w:r>
-        <w:t>elect</w:t>
-      </w:r>
-      <w:r>
-        <w:t>s</w:t>
-      </w:r>
-      <w:r>
-        <w:t xml:space="preserve"> to terminate </w:t>
-      </w:r>
-      <w:r>
-        <w:t>its</w:t>
-      </w:r>
-      <w:r>
-        <w:t xml:space="preserve"> services for nonpayment, </w:t>
-      </w:r>
-      <w:r>
-        <w:t>ONYX’s</w:t>
-      </w:r>
-      <w:r>
-        <w:t xml:space="preserve"> </w:t>
-      </w:r>
-      <w:r>
-        <w:t xml:space="preserve">engagement will be deemed to have been completed even if </w:t>
-      </w:r>
-      <w:r>
-        <w:t>it has</w:t>
-      </w:r>
-      <w:r>
-        <w:t xml:space="preserve"> not </w:t>
-      </w:r>
-      <w:r>
-        <w:t xml:space="preserve">provided </w:t>
-      </w:r>
-      <w:r>
-        <w:t xml:space="preserve">the Client </w:t>
-      </w:r>
-      <w:r>
-        <w:t xml:space="preserve">with the </w:t>
-      </w:r>
-      <w:r>
-        <w:rPr>
-          <w:noProof/>
-        </w:rPr>
-        <w:t>the books and supporting schedules</w:t>
-      </w:r>
-      <w:r>
-        <w:t xml:space="preserve">. </w:t>
-      </w:r>
-      <w:r>
-        <w:t>The Client</w:t>
-      </w:r>
-      <w:r>
-        <w:t xml:space="preserve"> </w:t>
-      </w:r>
-      <w:r>
-        <w:t xml:space="preserve">will be obligated to compensate </w:t>
-      </w:r>
-      <w:r>
-        <w:t>ONYX</w:t>
-      </w:r>
-      <w:r>
-        <w:t xml:space="preserve"> </w:t>
-      </w:r>
-      <w:r>
-        <w:t xml:space="preserve">for all time expended and to reimburse </w:t>
-      </w:r>
-      <w:r>
-        <w:t>ONYX</w:t>
-      </w:r>
-      <w:r>
-        <w:t xml:space="preserve"> </w:t>
-      </w:r>
-      <w:r>
-        <w:t>for all out-of-pocket expenditures through the date of termination.</w:t>
-      </w:r>
-    </w:p>
-    <w:p>
-      <w:pPr>
-        <w:pStyle w:val="CLALTRNormal"/>
-        <w:jc w:val="both"/>
-      </w:pPr>
-      <w:r>
-        <w:t xml:space="preserve">If the Client disputes or questions any charges on </w:t>
-      </w:r>
-      <w:r>
-        <w:t xml:space="preserve">any invoice, then the Client must notify </w:t>
-      </w:r>
-      <w:proofErr w:type="gramStart"/>
-      <w:r>
-        <w:t>ONYX,</w:t>
-      </w:r>
-      <w:proofErr w:type="gramEnd"/>
-      <w:r>
-        <w:t xml:space="preserve"> IN WRITING, listing the specific time entries or costs on the invoices the Client is disputing within thirty (30) days of the date shown on the invoice. If ONYX does not receive written notice of any such dispute or question within thirty (30) days of the date shown on the invoice, then ONYX will understand the Client’s silence to mean that the Client </w:t>
-      </w:r>
-      <w:r>
-        <w:t xml:space="preserve">finds the billing statement, and </w:t>
-      </w:r>
-      <w:proofErr w:type="gramStart"/>
-      <w:r>
-        <w:t>all of</w:t>
-      </w:r>
-      <w:proofErr w:type="gramEnd"/>
-      <w:r>
-        <w:t xml:space="preserve"> its itemized charges and costs, acceptable and reasonable.</w:t>
-      </w:r>
-    </w:p>
-    <w:p>
-      <w:pPr>
-        <w:pStyle w:val="CLALTRHeading2"/>
-        <w:jc w:val="both"/>
-      </w:pPr>
-      <w:r>
-        <w:rPr/>
-        <w:t>Retainer</w:t>
-      </w:r>
-    </w:p>
-    <w:p>
-      <w:pPr>
-        <w:pStyle w:val="CLALTRNormal"/>
-        <w:jc w:val="both"/>
-      </w:pPr>
-      <w:r>
-        <w:rPr/>
-        <w:t xml:space="preserve">In connection with this engagement, </w:t>
-      </w:r>
-      <w:r>
-        <w:rPr/>
-        <w:t>ONYX</w:t>
-      </w:r>
-      <w:r>
-        <w:rPr/>
-        <w:t xml:space="preserve"> </w:t>
-      </w:r>
-      <w:r>
-        <w:rPr/>
-        <w:t>must receive a retainer in the initial amount of</w:t>
-      </w:r>
-      <w:r>
-        <w:rPr/>
-        <w:t xml:space="preserve"> </w:t>
-      </w:r>
-      <w:r>
-        <w:rPr/>
-        <w:t>$</w:t>
-      </w:r>
-      <w:r>
-        <w:rPr>
-          <w:b/>
-          <w:i/>
-        </w:rPr>
-      </w:r>
-      <w:r>
-        <w:rPr>
+          <w:bCs/>
           <w:noProof/>
         </w:rPr>
         <w:t>3,000</w:t>
@@ -2041,75 +1830,57 @@
         <w:t xml:space="preserve"> (the “Retainer”)</w:t>
       </w:r>
       <w:r>
-        <w:rPr/>
         <w:t>, payable prior to the commencement of any services.</w:t>
       </w:r>
       <w:r>
-        <w:rPr/>
         <w:t xml:space="preserve"> </w:t>
       </w:r>
       <w:r>
-        <w:rPr/>
         <w:t xml:space="preserve">The Client expressly grants ONYX a possessory security interest </w:t>
       </w:r>
       <w:r>
-        <w:rPr/>
         <w:t>in the</w:t>
       </w:r>
       <w:r>
-        <w:rPr/>
         <w:t xml:space="preserve"> Retainer</w:t>
       </w:r>
       <w:r>
-        <w:rPr/>
         <w:t xml:space="preserve"> to secure the payment of ONYX’s fees and costs. The Client also authorizes ONYX to withdraw from the Retainer any sums necessary to </w:t>
       </w:r>
       <w:r>
-        <w:rPr/>
         <w:t>pay fees charged, and costs incurred, from ONYX’s engagement.</w:t>
       </w:r>
       <w:r>
-        <w:rPr/>
         <w:t xml:space="preserve"> </w:t>
       </w:r>
       <w:r>
-        <w:rPr/>
         <w:t>T</w:t>
       </w:r>
       <w:r>
-        <w:rPr/>
         <w:t xml:space="preserve">he </w:t>
       </w:r>
       <w:r>
-        <w:rPr/>
         <w:t>R</w:t>
       </w:r>
       <w:r>
-        <w:rPr/>
         <w:t xml:space="preserve">etainer will be applied to </w:t>
       </w:r>
       <w:r>
-        <w:rPr/>
         <w:t>ONYX’s</w:t>
       </w:r>
       <w:r>
-        <w:rPr/>
         <w:t xml:space="preserve"> </w:t>
       </w:r>
       <w:r>
-        <w:rPr/>
         <w:t>final invoice</w:t>
       </w:r>
       <w:r>
-        <w:rPr/>
         <w:t>. The Client must also still pay any remaining balance due to ONYX</w:t>
       </w:r>
       <w:r>
-        <w:rPr/>
         <w:t xml:space="preserve"> after the Retainer is applied to the final invoice. We will refund to the Client any unearned balance remaining from the Retainer when we conclude our engagement</w:t>
       </w:r>
       <w:r>
-        <w:rPr/>
         <w:t>.</w:t>
       </w:r>
     </w:p>
@@ -2119,7 +1890,6 @@
         <w:jc w:val="both"/>
       </w:pPr>
       <w:r>
-        <w:lastRenderedPageBreak/>
         <w:t>Other fees</w:t>
       </w:r>
     </w:p>
@@ -2210,37 +1980,13 @@
         <w:t xml:space="preserve">billing </w:t>
       </w:r>
       <w:r>
-        <w:t xml:space="preserve">date, the unpaid balance shall accrue interest at the monthly rate of one and one-quarter percent (1.25%), which is an annual percentage rate of 15%. </w:t>
-      </w:r>
-      <w:proofErr w:type="gramStart"/>
-      <w:r>
-        <w:t>In the event that</w:t>
-      </w:r>
-      <w:proofErr w:type="gramEnd"/>
-      <w:r>
-        <w:t xml:space="preserve"> any collection action is required to collect unpaid balances </w:t>
-      </w:r>
-      <w:proofErr w:type="gramStart"/>
-      <w:r>
-        <w:t>due</w:t>
-      </w:r>
-      <w:proofErr w:type="gramEnd"/>
-      <w:r>
-        <w:t xml:space="preserve"> us, </w:t>
+        <w:t xml:space="preserve">date, the unpaid balance shall accrue interest at the monthly rate of one and one-quarter percent (1.25%), which is an annual percentage rate of 15%. In the event that any collection action is required to collect unpaid balances due us, </w:t>
       </w:r>
       <w:r>
         <w:t xml:space="preserve">then the Client agrees that ONYX (or any attorney that ONYX may hire for this purpose) may also recover from the Client the </w:t>
       </w:r>
       <w:r>
-        <w:t xml:space="preserve">attorneys’ fees and costs to collect such sums, </w:t>
-      </w:r>
-      <w:proofErr w:type="gramStart"/>
-      <w:r>
-        <w:t>whether or not</w:t>
-      </w:r>
-      <w:proofErr w:type="gramEnd"/>
-      <w:r>
-        <w:t xml:space="preserve"> the Client contests the matter.</w:t>
+        <w:t>attorneys’ fees and costs to collect such sums, whether or not the Client contests the matter.</w:t>
       </w:r>
     </w:p>
     <w:p>
@@ -2249,25 +1995,25 @@
         <w:jc w:val="both"/>
       </w:pPr>
       <w:r>
-        <w:t xml:space="preserve">Our service commitment</w:t>
-      </w:r>
-    </w:p>
-    <w:p>
-      <w:pPr>
-        <w:pStyle w:val="CLALTRNormal"/>
-        <w:jc w:val="both"/>
-      </w:pPr>
-      <w:r>
-        <w:t xml:space="preserve">We stand behind our work. Upon full payment of our invoice, we will consider you satisfied with our services and our service commitment fulfilled.</w:t>
-      </w:r>
-    </w:p>
-    <w:p>
-      <w:pPr>
-        <w:pStyle w:val="CLALTRNormal"/>
-        <w:jc w:val="both"/>
-      </w:pPr>
-      <w:r>
-        <w:t xml:space="preserve">To ensure that ONYX’s services remain responsive to the Client’s needs, and fair to both parties, ONYX will meet with the Client throughout the term of this agreement and, as needs change, revise or adjust the scope of services and the related fees — without the need to re-execute this agreement. Such revisions or adjustments take effect once confirmed in writing, including by email, by both ONYX and the Client; no signature, formal addendum, or re-execution of this agreement is required.</w:t>
+        <w:t>Our service commitment</w:t>
+      </w:r>
+    </w:p>
+    <w:p>
+      <w:pPr>
+        <w:pStyle w:val="CLALTRNormal"/>
+        <w:jc w:val="both"/>
+      </w:pPr>
+      <w:r>
+        <w:t>We stand behind our work. Upon full payment of our invoice, we will consider you satisfied with our services and our service commitment fulfilled.</w:t>
+      </w:r>
+    </w:p>
+    <w:p>
+      <w:pPr>
+        <w:pStyle w:val="CLALTRNormal"/>
+        <w:jc w:val="both"/>
+      </w:pPr>
+      <w:r>
+        <w:t>To ensure that ONYX’s services remain responsive to the Client’s needs, and fair to both parties, ONYX will meet with the Client throughout the term of this agreement and, as needs change, revise or adjust the scope of services and the related fees — without the need to re-execute this agreement. Such revisions or adjustments take effect once confirmed in writing, including by email, by both ONYX and the Client; no signature, formal addendum, or re-execution of this agreement is required.</w:t>
       </w:r>
     </w:p>
     <w:p>
@@ -2294,13 +2040,8 @@
         <w:t>)</w:t>
       </w:r>
       <w:r>
-        <w:t xml:space="preserve"> </w:t>
-      </w:r>
-      <w:proofErr w:type="gramStart"/>
-      <w:r>
-        <w:t>days</w:t>
-      </w:r>
-      <w:proofErr w:type="gramEnd"/>
+        <w:t xml:space="preserve"> days</w:t>
+      </w:r>
       <w:r>
         <w:t xml:space="preserve"> written notice to the other party. In that event, the provisions of this agreement shall continue to apply to all services rendered prior to termination. It is understood that any unpaid fees that are owed or invoices that are outstanding at the date of termination are to be paid in accordance with the terms of this agreement.</w:t>
       </w:r>
@@ -2320,11 +2061,12 @@
         <w:rPr>
           <w:caps/>
           <w:color w:val="7F7F7F"/>
+          <w:spacing w:val="60"/>
           <w:sz w:val="18"/>
           <w:szCs w:val="18"/>
-          <w:spacing w:val="60"/>
-        </w:rPr>
-        <w:t xml:space="preserve">Section 2</w:t>
+        </w:rPr>
+        <w:lastRenderedPageBreak/>
+        <w:t>Section 2</w:t>
       </w:r>
       <w:r>
         <w:br/>
@@ -2334,16 +2076,16 @@
           <w:sz w:val="48"/>
           <w:szCs w:val="48"/>
         </w:rPr>
-        <w:t xml:space="preserve">Terms and Conditions</w:t>
-      </w:r>
-    </w:p>
-    <w:p>
-      <w:pPr>
-        <w:pStyle w:val="CLALTRNormal"/>
-        <w:jc w:val="both"/>
-      </w:pPr>
-      <w:r>
-        <w:t xml:space="preserve">The following terms govern our engagement. They define each party’s responsibilities, allocate risk between us, and explain how any questions or disputes will be handled.</w:t>
+        <w:t>Terms and Conditions</w:t>
+      </w:r>
+    </w:p>
+    <w:p>
+      <w:pPr>
+        <w:pStyle w:val="CLALTRNormal"/>
+        <w:jc w:val="both"/>
+      </w:pPr>
+      <w:r>
+        <w:t>The following terms govern our engagement. They define each party’s responsibilities, allocate risk between us, and explain how any questions or disputes will be handled.</w:t>
       </w:r>
     </w:p>
     <w:p>
@@ -2361,7 +2103,10 @@
         <w:jc w:val="both"/>
       </w:pPr>
       <w:r>
-        <w:t xml:space="preserve">The objective of ONYX’s engagement is to assist the Client in the preparation of financial statements by providing the services identified above. ONYX has not been engaged to prepare financial statements, and financial statements will not be presented to the Client. Financial statements that may be generated from the Client’s accounting system have not been prepared, compiled, reviewed, or audited by ONYX and, accordingly, will not include an opinion or any other form of assurance. The financial statements will not be accompanied by a report, and ONYX should not be discussed or associated with them. Any analysis or presentation of financial information that ONYX provides to management is based on financial statements generated from the Client’s accounting system and does not constitute the preparation, compilation, review, or audit of financial statements by ONYX.</w:t>
+        <w:t xml:space="preserve">The objective of ONYX’s engagement is to assist the Client in the preparation of financial statements by providing the services identified above. ONYX has not been engaged to prepare financial statements, and financial statements will not be presented to the Client. Financial statements that may be generated from the Client’s accounting system have not been prepared, compiled, reviewed, or audited by ONYX and, accordingly, will not include an opinion or any other form of assurance. The financial statements </w:t>
+      </w:r>
+      <w:r>
+        <w:t>will not be accompanied by a report, and ONYX should not be discussed or associated with them. Any analysis or presentation of financial information that ONYX provides to management is based on financial statements generated from the Client’s accounting system and does not constitute the preparation, compilation, review, or audit of financial statements by ONYX.</w:t>
       </w:r>
     </w:p>
     <w:p>
@@ -2622,15 +2367,7 @@
         <w:t xml:space="preserve"> </w:t>
       </w:r>
       <w:r>
-        <w:t xml:space="preserve">shall not be responsible for any </w:t>
-      </w:r>
-      <w:proofErr w:type="gramStart"/>
-      <w:r>
-        <w:t>misstatements</w:t>
-      </w:r>
-      <w:proofErr w:type="gramEnd"/>
-      <w:r>
-        <w:t xml:space="preserve"> in the </w:t>
+        <w:t xml:space="preserve">shall not be responsible for any misstatements in the </w:t>
       </w:r>
       <w:r>
         <w:t>Client’s</w:t>
@@ -2645,15 +2382,7 @@
         <w:t>not be identified</w:t>
       </w:r>
       <w:r>
-        <w:t xml:space="preserve"> </w:t>
-      </w:r>
-      <w:proofErr w:type="gramStart"/>
-      <w:r>
-        <w:t>as a result of</w:t>
-      </w:r>
-      <w:proofErr w:type="gramEnd"/>
-      <w:r>
-        <w:t xml:space="preserve"> misrepresentations made to </w:t>
+        <w:t xml:space="preserve"> as a result of misrepresentations made to </w:t>
       </w:r>
       <w:r>
         <w:t>ONYX</w:t>
@@ -2711,15 +2440,7 @@
         <w:t>business entity</w:t>
       </w:r>
       <w:r>
-        <w:t xml:space="preserve">, then ONYX does NOT also represent any of the Client’s individual partners, members, officers, directors or employees (as the case may be) or any other entities whose interests are represented by those </w:t>
-      </w:r>
-      <w:proofErr w:type="gramStart"/>
-      <w:r>
-        <w:t>persons</w:t>
-      </w:r>
-      <w:proofErr w:type="gramEnd"/>
-      <w:r>
-        <w:t>, unless ONYX agrees to do so in writing.</w:t>
+        <w:t>, then ONYX does NOT also represent any of the Client’s individual partners, members, officers, directors or employees (as the case may be) or any other entities whose interests are represented by those persons, unless ONYX agrees to do so in writing.</w:t>
       </w:r>
     </w:p>
     <w:p>
@@ -2740,16 +2461,23 @@
         <w:jc w:val="both"/>
       </w:pPr>
       <w:r>
-        <w:t xml:space="preserve">Client indemnification</w:t>
-      </w:r>
-    </w:p>
-    <w:p>
-      <w:pPr>
-        <w:pStyle w:val="CLALTRNormal"/>
-        <w:jc w:val="both"/>
-      </w:pPr>
-      <w:r>
-        <w:t xml:space="preserve">Client shall indemnify, defend, and hold harmless ONYX, its partners, principals, directors, officers, employees, agents, subcontractors, and affiliates (collectively, the “ONYX Parties” and each an “ONYX Party”) from and against any and all third-party claims, demands, actions, damages, losses, liabilities, penalties, fines, judgments, costs, and expenses, including reasonable attorneys’ fees and defense costs, arising out of or relating to: (a) information, records, or data provided by Client that is inaccurate, incomplete, misleading, or untimely; (b) instructions, approvals, authorizations, or decisions made by Client or its representatives; (c) Client’s failure to maintain adequate internal controls, oversight, or segregation of duties; (d) payments, wire transfers, payroll transactions, vendor setups, customer setups, or other financial transactions approved by Client; (e) acts or omissions of Client’s employees, officers, owners, agents, contractors, or other service providers; or (f) Client’s violation of any applicable law, regulation, contract, or legal obligation. This indemnification obligation shall not apply to the extent a claim is finally determined by a court or arbitrator of competent jurisdiction to have resulted from the gross negligence or willful misconduct of an ONYX Party.</w:t>
+        <w:lastRenderedPageBreak/>
+        <w:t>Client indemnification</w:t>
+      </w:r>
+    </w:p>
+    <w:p>
+      <w:pPr>
+        <w:pStyle w:val="CLALTRNormal"/>
+        <w:jc w:val="both"/>
+      </w:pPr>
+      <w:r>
+        <w:t>Client shall indemnify, defend, and hold harmless ONYX, its partners, principals, directors, officers, employees, agents, subcontractors, and affiliates (collectively, the “ONYX Parties” and each an “ONYX Party”) from and against any and all third-party claims, demands, actions, damages, losses, liabilities, penalties, fines, judgments, costs, and expenses, including reasonable attorneys’ fees and defense costs, arising out of or relating to: (a) information, records, or data provided by Client that is inac</w:t>
+      </w:r>
+      <w:r>
+        <w:t>curate, incomplete, misleading, or untimely; (b) instructions, approvals, authorizations, or decisions made by Client or its representatives; (c) Client’s failure to maintain adequate internal controls, oversight, or segregation of duties; (d) payments, wire transfers, payroll transactions, vendor setups, customer setups, or other financial transactions approved by Client; (e) acts or omissions of Client’s employees, officers, owners, agents, contractors, or other service providers; or (f) Client’s violatio</w:t>
+      </w:r>
+      <w:r>
+        <w:t>n of any applicable law, regulation, contract, or legal obligation. This indemnification obligation shall not apply to the extent a claim is finally determined by a court or arbitrator of competent jurisdiction to have resulted from the gross negligence or willful misconduct of an ONYX Party.</w:t>
       </w:r>
     </w:p>
     <w:p>
@@ -2767,7 +2495,7 @@
         <w:jc w:val="both"/>
       </w:pPr>
       <w:r>
-        <w:t xml:space="preserve">ONYX’s role is strictly limited to the engagement described in this letter, and ONYX offers no assurance as to the results or ultimate outcomes of this engagement or of any decisions that the Client may make based on ONYX’s communications with the Client. The Client agrees that it is appropriate to limit the liability of the ONYX Parties.</w:t>
+        <w:t>ONYX’s role is strictly limited to the engagement described in this letter, and ONYX offers no assurance as to the results or ultimate outcomes of this engagement or of any decisions that the Client may make based on ONYX’s communications with the Client. The Client agrees that it is appropriate to limit the liability of the ONYX Parties.</w:t>
       </w:r>
     </w:p>
     <w:p>
@@ -2824,38 +2552,33 @@
         <w:jc w:val="both"/>
       </w:pPr>
       <w:r>
-        <w:t xml:space="preserve">The Client further agrees that it will not hold ONYX or any other ONYX Party liable for any claim, cost, or damage, whether based on warranty, tort, contract, or other law, arising from or related to this agreement, the services provided under this agreement, the work product, or for any plans, actions, or results of this engagement, except to the extent authorized by this agreement.</w:t>
-      </w:r>
-    </w:p>
-    <w:p>
-      <w:pPr>
-        <w:pStyle w:val="CLALTRNormal"/>
-        <w:jc w:val="both"/>
-      </w:pPr>
-      <w:r>
-        <w:t xml:space="preserve">To the fullest extent permitted by law, the aggregate liability of all ONYX Parties arising out of or relating to this agreement, the services provided under this agreement, or any work product delivered pursuant to this agreement, regardless of the form of action and whether based in contract, tort, negligence, strict liability, statute, fiduciary theory, or otherwise, shall not exceed the total fees actually paid by Client to ONYX under this agreement during the twelve (12) months immediately preceding the event giving rise to the claim.</w:t>
-      </w:r>
-    </w:p>
-    <w:p>
-      <w:pPr>
-        <w:pStyle w:val="CLALTRNormal"/>
-        <w:jc w:val="both"/>
-      </w:pPr>
-      <w:r>
-        <w:t xml:space="preserve">In no event shall any ONYX Party be liable for any indirect, consequential, special, incidental, exemplary, enhanced, or punitive damages, including without limitation loss of profits, loss of revenue, loss of business opportunity, loss of anticipated savings, loss of data, loss of goodwill, business interruption losses, or attorneys’ fees and costs, regardless of the legal theory asserted and even if advised of the possibility of such damages.</w:t>
-      </w:r>
-    </w:p>
-    <w:p>
-      <w:pPr>
-        <w:pStyle w:val="CLALTRNormal"/>
-        <w:jc w:val="both"/>
-      </w:pPr>
-    </w:p>
-    <w:p>
-      <w:pPr>
-        <w:pStyle w:val="CLALTRNormal"/>
-        <w:jc w:val="both"/>
-      </w:pPr>
+        <w:t>The Client further agrees that it will not hold ONYX or any other ONYX Party liable for any claim, cost, or damage, whether based on warranty, tort, contract, or other law, arising from or related to this agreement, the services provided under this agreement, the work product, or for any plans, actions, or results of this engagement, except to the extent authorized by this agreement.</w:t>
+      </w:r>
+    </w:p>
+    <w:p>
+      <w:pPr>
+        <w:pStyle w:val="CLALTRNormal"/>
+        <w:jc w:val="both"/>
+      </w:pPr>
+      <w:r>
+        <w:t>To the fullest extent permitted by law, the aggregate liability of all ONYX Parties arising out of or relating to this agreement, the services provided under this agreement, or any work product delivered pursuant to this agreement, regardless of the form of action and whether based in contract, tort, negligence, strict liability, statute, fiduciary theory, or otherwise, shall not exceed the total fees actually paid by Client to ONYX under this agreement during the twelve (12) months immediately preceding th</w:t>
+      </w:r>
+      <w:r>
+        <w:t>e event giving rise to the claim.</w:t>
+      </w:r>
+    </w:p>
+    <w:p>
+      <w:pPr>
+        <w:pStyle w:val="CLALTRNormal"/>
+        <w:jc w:val="both"/>
+      </w:pPr>
+      <w:r>
+        <w:t xml:space="preserve">In no event shall any ONYX Party be liable for any indirect, consequential, special, incidental, exemplary, enhanced, or punitive damages, including without limitation loss of profits, loss of revenue, loss of business opportunity, loss </w:t>
+      </w:r>
+      <w:r>
+        <w:lastRenderedPageBreak/>
+        <w:t>of anticipated savings, loss of data, loss of goodwill, business interruption losses, or attorneys’ fees and costs, regardless of the legal theory asserted and even if advised of the possibility of such damages.</w:t>
+      </w:r>
     </w:p>
     <w:p>
       <w:pPr>
@@ -2863,518 +2586,494 @@
         <w:jc w:val="both"/>
       </w:pPr>
       <w:r>
+        <w:t>Time limitation</w:t>
+      </w:r>
+    </w:p>
+    <w:p>
+      <w:pPr>
+        <w:pStyle w:val="CLALTRNormal"/>
+        <w:jc w:val="both"/>
+      </w:pPr>
+      <w:r>
+        <w:t xml:space="preserve">The nature of our services makes it difficult, with the passage of time, to gather and present evidence that fully and fairly establishes the facts underlying any dispute that may arise between </w:t>
+      </w:r>
+      <w:r>
+        <w:t xml:space="preserve">the Client </w:t>
+      </w:r>
+      <w:r>
+        <w:t xml:space="preserve">and any </w:t>
+      </w:r>
+      <w:r>
+        <w:t>ONYX</w:t>
+      </w:r>
+      <w:r>
+        <w:t xml:space="preserve"> </w:t>
+      </w:r>
+      <w:r>
+        <w:t>P</w:t>
+      </w:r>
+      <w:r>
+        <w:t xml:space="preserve">arty. The </w:t>
+      </w:r>
+      <w:r>
+        <w:t>Client and ONYX</w:t>
+      </w:r>
+      <w:r>
+        <w:t xml:space="preserve"> agree that, notwithstanding any statute or law of limitations that might otherwise apply to a dispute, including one arising out of this agreement or the services performed under this agreement, for breach of contract or fiduciary duty, tort, fraud, misrepresentation or any other cause of action or remedy, any action or legal proceeding by </w:t>
+      </w:r>
+      <w:r>
+        <w:t xml:space="preserve">the Client </w:t>
+      </w:r>
+      <w:r>
+        <w:t xml:space="preserve">against any </w:t>
+      </w:r>
+      <w:r>
+        <w:t>ONYX</w:t>
+      </w:r>
+      <w:r>
+        <w:t xml:space="preserve"> </w:t>
+      </w:r>
+      <w:r>
+        <w:t>P</w:t>
+      </w:r>
+      <w:r>
+        <w:t xml:space="preserve">arty must be commenced separately </w:t>
+      </w:r>
+      <w:r>
+        <w:t xml:space="preserve">within twenty-four (24) </w:t>
+      </w:r>
+      <w:r>
+        <w:t xml:space="preserve">months after the date when </w:t>
+      </w:r>
+      <w:r>
+        <w:t xml:space="preserve">ONYX </w:t>
+      </w:r>
+      <w:r>
+        <w:t>deliver</w:t>
+      </w:r>
+      <w:r>
+        <w:t>s</w:t>
+      </w:r>
+      <w:r>
+        <w:t xml:space="preserve"> such services under this agreement to </w:t>
+      </w:r>
+      <w:r>
+        <w:t xml:space="preserve">the Client </w:t>
+      </w:r>
+      <w:r>
+        <w:t>on which the dispute is based</w:t>
+      </w:r>
+      <w:r>
+        <w:t xml:space="preserve"> (the “Limitation Period”)</w:t>
+      </w:r>
+      <w:r>
+        <w:t xml:space="preserve">, regardless of whether any </w:t>
+      </w:r>
+      <w:r>
+        <w:t>ONYX</w:t>
+      </w:r>
+      <w:r>
+        <w:t xml:space="preserve"> </w:t>
+      </w:r>
+      <w:r>
+        <w:t>P</w:t>
+      </w:r>
+      <w:r>
+        <w:t xml:space="preserve">arty provides other services for </w:t>
+      </w:r>
+      <w:r>
+        <w:t xml:space="preserve">the Client </w:t>
+      </w:r>
+      <w:r>
+        <w:t xml:space="preserve">under this agreement, or </w:t>
+      </w:r>
+      <w:r>
+        <w:t xml:space="preserve">the Client </w:t>
+      </w:r>
+      <w:r>
+        <w:t>shall be forever barred from commencing a lawsuit or obtaining any legal or equitable relief or recovery</w:t>
+      </w:r>
+      <w:r>
+        <w:t xml:space="preserve"> against any ONYX Party</w:t>
+      </w:r>
+      <w:r>
+        <w:t>.</w:t>
+      </w:r>
+      <w:r>
+        <w:t xml:space="preserve"> </w:t>
+      </w:r>
+    </w:p>
+    <w:p>
+      <w:pPr>
+        <w:pStyle w:val="CLALTRNormal"/>
+        <w:jc w:val="both"/>
+      </w:pPr>
+      <w:r>
+        <w:t xml:space="preserve">The Limitation Period applies and begins to run even if </w:t>
+      </w:r>
+      <w:r>
+        <w:t xml:space="preserve">the Client </w:t>
+      </w:r>
+      <w:r>
+        <w:t>ha</w:t>
+      </w:r>
+      <w:r>
+        <w:t>s</w:t>
+      </w:r>
+      <w:r>
+        <w:t xml:space="preserve"> not suffered any damage or loss or ha</w:t>
+      </w:r>
+      <w:r>
+        <w:t>s</w:t>
+      </w:r>
+      <w:r>
+        <w:t xml:space="preserve"> not become aware of the existence or possible existence of a dispute.</w:t>
+      </w:r>
+    </w:p>
+    <w:p>
+      <w:pPr>
+        <w:pStyle w:val="CLALTRHeading1"/>
+        <w:jc w:val="both"/>
+      </w:pPr>
+      <w:r>
+        <w:t>Other provisions</w:t>
+      </w:r>
+    </w:p>
+    <w:p>
+      <w:pPr>
+        <w:pStyle w:val="CLALTRNormal"/>
+        <w:jc w:val="both"/>
+      </w:pPr>
+      <w:r>
+        <w:t>Except as permitted by the “Consent” section of this agreement,</w:t>
+      </w:r>
+      <w:r>
+        <w:t xml:space="preserve"> </w:t>
+      </w:r>
+      <w:r>
+        <w:t>ONYX</w:t>
+      </w:r>
+      <w:r>
+        <w:t xml:space="preserve"> will not disclose any confidential, proprietary, or privileged information of the entity to any persons without the </w:t>
+      </w:r>
+      <w:r>
+        <w:t xml:space="preserve">Client’s </w:t>
+      </w:r>
+      <w:r>
+        <w:t>authorization or unless required by law.</w:t>
+      </w:r>
+      <w:r>
+        <w:t xml:space="preserve"> </w:t>
+      </w:r>
+      <w:r>
+        <w:t xml:space="preserve">This confidentiality provision does not prohibit </w:t>
+      </w:r>
+      <w:r>
+        <w:t xml:space="preserve">ONYX </w:t>
+      </w:r>
+      <w:r>
+        <w:t xml:space="preserve">from disclosing </w:t>
+      </w:r>
+      <w:r>
+        <w:t xml:space="preserve">the Client’s </w:t>
+      </w:r>
+      <w:r>
+        <w:t xml:space="preserve">information to one or more of our affiliated companies in order to provide services that </w:t>
+      </w:r>
+      <w:r>
+        <w:t xml:space="preserve">the Client </w:t>
+      </w:r>
+      <w:r>
+        <w:t>ha</w:t>
+      </w:r>
+      <w:r>
+        <w:t>s</w:t>
+      </w:r>
+      <w:r>
+        <w:t xml:space="preserve"> requested from </w:t>
+      </w:r>
+      <w:r>
+        <w:t xml:space="preserve">ONYX </w:t>
+      </w:r>
+      <w:r>
+        <w:t xml:space="preserve">or from any such affiliated company. Any such affiliated company shall be subject to the same restrictions on the use and disclosure of </w:t>
+      </w:r>
+      <w:r>
+        <w:t xml:space="preserve">the Client’s </w:t>
+      </w:r>
+      <w:r>
+        <w:t xml:space="preserve">information as apply to </w:t>
+      </w:r>
+      <w:r>
+        <w:t>ONYX</w:t>
+      </w:r>
+      <w:r>
+        <w:t>.</w:t>
+      </w:r>
+    </w:p>
+    <w:p>
+      <w:pPr>
+        <w:pStyle w:val="CLALTRNormal"/>
+        <w:jc w:val="both"/>
+      </w:pPr>
+      <w:r>
+        <w:t xml:space="preserve">ONYX </w:t>
+      </w:r>
+      <w:r>
+        <w:t xml:space="preserve">will be responsible for </w:t>
+      </w:r>
+      <w:r>
+        <w:t xml:space="preserve">its </w:t>
+      </w:r>
+      <w:r>
+        <w:t xml:space="preserve">property and casualty, general liability, and workers compensation insurance, taxes, professional training, and other personnel costs related to the operation of </w:t>
+      </w:r>
+      <w:r>
+        <w:t xml:space="preserve">its </w:t>
+      </w:r>
+      <w:r>
+        <w:t xml:space="preserve">business. </w:t>
+      </w:r>
+    </w:p>
+    <w:p>
+      <w:pPr>
+        <w:pStyle w:val="CLALTRNormal"/>
+        <w:jc w:val="both"/>
+      </w:pPr>
+      <w:r>
+        <w:t xml:space="preserve">When performing the services above, </w:t>
+      </w:r>
+      <w:r>
+        <w:t xml:space="preserve">ONYX </w:t>
+      </w:r>
+      <w:r>
+        <w:t xml:space="preserve">will utilize the resources available </w:t>
+      </w:r>
+      <w:r>
+        <w:t xml:space="preserve">from </w:t>
+      </w:r>
+      <w:r>
+        <w:t xml:space="preserve">the </w:t>
+      </w:r>
+      <w:r>
+        <w:t xml:space="preserve">Client </w:t>
+      </w:r>
+      <w:r>
+        <w:t xml:space="preserve">to the extent practical to continue development of </w:t>
+      </w:r>
+      <w:r>
+        <w:t xml:space="preserve">the Client’s </w:t>
+      </w:r>
+      <w:r>
+        <w:t xml:space="preserve">personnel. During a portion of </w:t>
+      </w:r>
+      <w:r>
+        <w:t xml:space="preserve">ONYX’s </w:t>
+      </w:r>
+      <w:r>
+        <w:t xml:space="preserve">work, </w:t>
+      </w:r>
+      <w:r>
+        <w:t xml:space="preserve">ONYX </w:t>
+      </w:r>
+      <w:r>
+        <w:t xml:space="preserve">may require the use of </w:t>
+      </w:r>
+      <w:r>
+        <w:t xml:space="preserve">the Client’s </w:t>
+      </w:r>
+      <w:r>
+        <w:t xml:space="preserve">computers. </w:t>
+      </w:r>
+      <w:r>
+        <w:t xml:space="preserve">ONYX </w:t>
+      </w:r>
+      <w:r>
+        <w:t>will try</w:t>
+      </w:r>
+      <w:r>
+        <w:t>, but does not guarantee,</w:t>
+      </w:r>
+      <w:r>
+        <w:t xml:space="preserve"> to give </w:t>
+      </w:r>
+      <w:r>
+        <w:t xml:space="preserve">the Client </w:t>
+      </w:r>
+      <w:r>
+        <w:t xml:space="preserve">advance notice and coordinate </w:t>
+      </w:r>
+      <w:r>
+        <w:t xml:space="preserve">its </w:t>
+      </w:r>
+      <w:r>
+        <w:t xml:space="preserve">use so it does not interfere with </w:t>
+      </w:r>
+      <w:r>
+        <w:t xml:space="preserve">the Client’s </w:t>
+      </w:r>
+      <w:r>
+        <w:t>employees.</w:t>
+      </w:r>
+    </w:p>
+    <w:p>
+      <w:pPr>
+        <w:pStyle w:val="CLALTRNormal"/>
+        <w:jc w:val="both"/>
+      </w:pPr>
+      <w:r>
+        <w:t xml:space="preserve">The relationship of </w:t>
+      </w:r>
+      <w:r>
+        <w:t>ONYX</w:t>
+      </w:r>
+      <w:r>
+        <w:t xml:space="preserve"> </w:t>
+      </w:r>
+      <w:r>
+        <w:t>with the Client</w:t>
+      </w:r>
+      <w:r>
+        <w:t xml:space="preserve"> shall be solely that of an independent contractor</w:t>
+      </w:r>
+      <w:r>
+        <w:t>,</w:t>
+      </w:r>
+      <w:r>
+        <w:t xml:space="preserve"> and nothing in this agreement shall be construed to create or imply any relationship of employment, agency, partnership, or any relationship other than</w:t>
+      </w:r>
+      <w:r>
+        <w:t xml:space="preserve"> that of</w:t>
+      </w:r>
+      <w:r>
+        <w:t xml:space="preserve"> an independent contractor.</w:t>
+      </w:r>
+    </w:p>
+    <w:p>
+      <w:pPr>
+        <w:pStyle w:val="CLALTRNormal"/>
+        <w:jc w:val="both"/>
+      </w:pPr>
+      <w:r>
+        <w:t>Accounting standards and procedures will be suggested that are consistent with those normally utilized in an entity of the Client’s size and nature. ONYX will require the Client to approve any changes in the application of accounting standards and procedures for the Client. Internal controls may be recommended relating to the safeguarding of the Client’s assets. If fraud is initiated by the Client’s employees or other service providers, any resulting losses shall be the Client’s responsibility, and the Clie</w:t>
+      </w:r>
+      <w:r>
+        <w:t>nt shall look first to its own insurance coverage.</w:t>
+      </w:r>
+    </w:p>
+    <w:p>
+      <w:pPr>
+        <w:pStyle w:val="CLALTRNormal"/>
+        <w:jc w:val="both"/>
+      </w:pPr>
+      <w:r>
         <w:lastRenderedPageBreak/>
-        <w:t>Time limitation</w:t>
-      </w:r>
-    </w:p>
-    <w:p>
-      <w:pPr>
-        <w:pStyle w:val="CLALTRNormal"/>
-        <w:jc w:val="both"/>
-      </w:pPr>
-      <w:r>
-        <w:t xml:space="preserve">The nature of our services makes it difficult, with the passage of time, to gather and present evidence that fully and fairly establishes the facts underlying any dispute that may arise between </w:t>
-      </w:r>
-      <w:r>
-        <w:t xml:space="preserve">the Client </w:t>
-      </w:r>
-      <w:r>
-        <w:t xml:space="preserve">and any </w:t>
+        <w:t xml:space="preserve">The </w:t>
+      </w:r>
+      <w:r>
+        <w:t xml:space="preserve">Client </w:t>
+      </w:r>
+      <w:r>
+        <w:t xml:space="preserve">agrees that </w:t>
       </w:r>
       <w:r>
         <w:t>ONYX</w:t>
       </w:r>
       <w:r>
+        <w:t xml:space="preserve"> will not be assuming any fiduciary responsibility on </w:t>
+      </w:r>
+      <w:r>
+        <w:t xml:space="preserve">the Client’s </w:t>
+      </w:r>
+      <w:r>
+        <w:t>behalf during the course of this engagement.</w:t>
+      </w:r>
+    </w:p>
+    <w:p>
+      <w:pPr>
+        <w:pStyle w:val="CLALTRNormal"/>
+        <w:jc w:val="both"/>
+      </w:pPr>
+      <w:r>
+        <w:t xml:space="preserve">The Client agrees that ONYX may communicate with the Client and its representatives (if the Client is a business entity) via electronic mail (“E-mail”) and text. The Client understands that ONYX will not encrypt or otherwise protect from interception and/or review by others E-mail </w:t>
+      </w:r>
+      <w:r>
+        <w:t>and text communications to and from the Client and ONYX unless the Client makes special arrangements with ONYX to do so. The Client consents to such communications.</w:t>
+      </w:r>
+    </w:p>
+    <w:p>
+      <w:pPr>
+        <w:pStyle w:val="CLALTRNormal"/>
+        <w:jc w:val="both"/>
+      </w:pPr>
+      <w:r>
+        <w:t>Each natural person who signs this letter in his or her individual capacity as a natural person or as a guarantor agrees to be jointly and severally liable with each other person signing this letter for the payment of ONYX’s fees and costs and personally guarantees the same. This provision does NOT apply to any natural person that signs this letter on behalf of any business entity other than a general partnership, unless the manner of signing shows that natural person’s intent to be bound individually or as a guarantor.</w:t>
+      </w:r>
+    </w:p>
+    <w:p>
+      <w:pPr>
+        <w:pStyle w:val="CLALTRNormal"/>
+        <w:jc w:val="both"/>
+      </w:pPr>
+      <w:r>
+        <w:t xml:space="preserve">Each person that signs this letter on behalf of any Client that is a business entity, by doing so, personally represents and warrants </w:t>
+      </w:r>
+      <w:r>
+        <w:t>to ONYX that he, she, or it has all requisite power and authority to engage ONYX and bind the business entity Client to the terms of this letter and that the Client on whose behalf the letter is signed has/have duly taken all necessary and proper corporate or other actions to engage ONYX pursuant to the terms of this letter.</w:t>
+      </w:r>
+    </w:p>
+    <w:p>
+      <w:pPr>
+        <w:pStyle w:val="CLALTRNormal"/>
+        <w:jc w:val="both"/>
+      </w:pPr>
+      <w:r>
+        <w:rPr>
+          <w:b/>
+        </w:rPr>
+        <w:t xml:space="preserve">Record retention.  </w:t>
+      </w:r>
+      <w:r>
+        <w:t>ONYX will retain its working papers, supporting schedules, and other documentation prepared in connection with this engagement for a period of seven (7) years from the completion of the applicable services, after which ONYX may destroy or otherwise dispose of such records without further notice to the Client. Working papers and other documents prepared by ONYX in the course of the engagement remain the property of ONYX. Original records, source documents, and other materials furnished by the Client remain t</w:t>
+      </w:r>
+      <w:r>
+        <w:t>he property of the Client and will be returned upon written request. The Client is responsible for maintaining its own copies of its records and for meeting its own record-retention obligations. ONYX has no obligation to retain any records or data beyond the seven (7) year period and may maintain such records in electronic form.</w:t>
+      </w:r>
+    </w:p>
+    <w:p>
+      <w:pPr>
+        <w:pStyle w:val="CLALTRHeading1"/>
+        <w:jc w:val="both"/>
+      </w:pPr>
+      <w:r>
+        <w:t>Employment provision</w:t>
+      </w:r>
+    </w:p>
+    <w:p>
+      <w:pPr>
+        <w:pStyle w:val="CLALTRNormal"/>
+        <w:jc w:val="both"/>
+      </w:pPr>
+      <w:r>
+        <w:t>In the event that a</w:t>
+      </w:r>
+      <w:r>
+        <w:t>n</w:t>
+      </w:r>
+      <w:r>
         <w:t xml:space="preserve"> </w:t>
       </w:r>
       <w:r>
-        <w:t>P</w:t>
-      </w:r>
-      <w:r>
-        <w:t xml:space="preserve">arty. The </w:t>
-      </w:r>
-      <w:r>
-        <w:t>Client and ONYX</w:t>
-      </w:r>
-      <w:r>
-        <w:t xml:space="preserve"> agree that, notwithstanding any statute or law of limitations that might otherwise apply to a dispute, including one arising out of this agreement or the services performed under this agreement, for breach of contract or fiduciary duty, tort, fraud, misrepresentation or any other cause of action or remedy, any action or legal proceeding by </w:t>
-      </w:r>
-      <w:r>
-        <w:t xml:space="preserve">the Client </w:t>
-      </w:r>
-      <w:r>
-        <w:t xml:space="preserve">against any </w:t>
-      </w:r>
-      <w:r>
         <w:t>ONYX</w:t>
       </w:r>
       <w:r>
-        <w:t xml:space="preserve"> </w:t>
-      </w:r>
-      <w:r>
-        <w:t>P</w:t>
-      </w:r>
-      <w:r>
-        <w:t xml:space="preserve">arty must be commenced separately </w:t>
-      </w:r>
-      <w:r>
-        <w:t xml:space="preserve">within twenty-four (24) </w:t>
-      </w:r>
-      <w:r>
-        <w:t xml:space="preserve">months after the date when </w:t>
-      </w:r>
-      <w:r>
-        <w:t xml:space="preserve">ONYX </w:t>
-      </w:r>
-      <w:r>
-        <w:t>deliver</w:t>
-      </w:r>
-      <w:r>
-        <w:t>s</w:t>
-      </w:r>
-      <w:r>
-        <w:t xml:space="preserve"> such services under this agreement to </w:t>
-      </w:r>
-      <w:r>
-        <w:t xml:space="preserve">the Client </w:t>
-      </w:r>
-      <w:r>
-        <w:t>on which the dispute is based</w:t>
-      </w:r>
-      <w:r>
-        <w:t xml:space="preserve"> (the “Limitation Period”)</w:t>
-      </w:r>
-      <w:r>
-        <w:t xml:space="preserve">, regardless of whether any </w:t>
-      </w:r>
-      <w:r>
-        <w:t>ONYX</w:t>
-      </w:r>
-      <w:r>
-        <w:t xml:space="preserve"> </w:t>
-      </w:r>
-      <w:r>
-        <w:t>P</w:t>
-      </w:r>
-      <w:r>
-        <w:t xml:space="preserve">arty provides other services for </w:t>
-      </w:r>
-      <w:r>
-        <w:t xml:space="preserve">the Client </w:t>
-      </w:r>
-      <w:r>
-        <w:t xml:space="preserve">under this agreement, or </w:t>
-      </w:r>
-      <w:r>
-        <w:t xml:space="preserve">the Client </w:t>
-      </w:r>
-      <w:r>
-        <w:t>shall be forever barred from commencing a lawsuit or obtaining any legal or equitable relief or recovery</w:t>
-      </w:r>
-      <w:r>
-        <w:t xml:space="preserve"> against any ONYX Party</w:t>
-      </w:r>
-      <w:r>
-        <w:t>.</w:t>
-      </w:r>
-      <w:r>
-        <w:t xml:space="preserve"> </w:t>
-      </w:r>
-    </w:p>
-    <w:p>
-      <w:pPr>
-        <w:pStyle w:val="CLALTRNormal"/>
-        <w:jc w:val="both"/>
-      </w:pPr>
-      <w:r>
-        <w:t xml:space="preserve">The Limitation Period applies and begins to run even if </w:t>
-      </w:r>
-      <w:r>
-        <w:t xml:space="preserve">the Client </w:t>
-      </w:r>
-      <w:r>
-        <w:t>ha</w:t>
-      </w:r>
-      <w:r>
-        <w:t>s</w:t>
-      </w:r>
-      <w:r>
-        <w:t xml:space="preserve"> not suffered any damage or loss or ha</w:t>
-      </w:r>
-      <w:r>
-        <w:t>s</w:t>
-      </w:r>
-      <w:r>
-        <w:t xml:space="preserve"> not become aware of the existence or possible existence of a dispute.</w:t>
-      </w:r>
-    </w:p>
-    <w:p>
-      <w:pPr>
-        <w:pStyle w:val="CLALTRHeading1"/>
-        <w:jc w:val="both"/>
-      </w:pPr>
-      <w:r>
-        <w:t>Other provisions</w:t>
-      </w:r>
-    </w:p>
-    <w:p>
-      <w:pPr>
-        <w:pStyle w:val="CLALTRNormal"/>
-        <w:jc w:val="both"/>
-      </w:pPr>
-      <w:r>
-        <w:t>Except as permitted by the “Consent” section of this agreement,</w:t>
-      </w:r>
-      <w:r>
-        <w:t xml:space="preserve"> </w:t>
-      </w:r>
-      <w:r>
-        <w:t>ONYX</w:t>
-      </w:r>
-      <w:r>
-        <w:t xml:space="preserve"> will not disclose any confidential, proprietary, or privileged information of the entity to any persons without the </w:t>
-      </w:r>
-      <w:r>
-        <w:t xml:space="preserve">Client’s </w:t>
-      </w:r>
-      <w:r>
-        <w:t>authorization or unless required by law.</w:t>
-      </w:r>
-      <w:r>
-        <w:t xml:space="preserve"> </w:t>
-      </w:r>
-      <w:r>
-        <w:t xml:space="preserve">This confidentiality provision does not prohibit </w:t>
-      </w:r>
-      <w:r>
-        <w:t xml:space="preserve">ONYX </w:t>
-      </w:r>
-      <w:r>
-        <w:t xml:space="preserve">from disclosing </w:t>
-      </w:r>
-      <w:r>
-        <w:t xml:space="preserve">the Client’s </w:t>
-      </w:r>
-      <w:r>
-        <w:t xml:space="preserve">information to one or more of our affiliated companies </w:t>
-      </w:r>
-      <w:proofErr w:type="gramStart"/>
-      <w:r>
-        <w:t>in order to</w:t>
-      </w:r>
-      <w:proofErr w:type="gramEnd"/>
-      <w:r>
-        <w:t xml:space="preserve"> provide services that </w:t>
-      </w:r>
-      <w:r>
-        <w:t xml:space="preserve">the Client </w:t>
-      </w:r>
-      <w:r>
-        <w:t>ha</w:t>
-      </w:r>
-      <w:r>
-        <w:t>s</w:t>
-      </w:r>
-      <w:r>
-        <w:t xml:space="preserve"> requested from </w:t>
-      </w:r>
-      <w:r>
-        <w:t xml:space="preserve">ONYX </w:t>
-      </w:r>
-      <w:r>
-        <w:t xml:space="preserve">or from any such affiliated company. Any such affiliated company shall be subject to the same restrictions on the use and disclosure of </w:t>
-      </w:r>
-      <w:r>
-        <w:t xml:space="preserve">the Client’s </w:t>
-      </w:r>
-      <w:r>
-        <w:t xml:space="preserve">information as apply to </w:t>
-      </w:r>
-      <w:r>
-        <w:t>ONYX</w:t>
-      </w:r>
-      <w:r>
-        <w:t>.</w:t>
-      </w:r>
-    </w:p>
-    <w:p>
-      <w:pPr>
-        <w:pStyle w:val="CLALTRNormal"/>
-        <w:jc w:val="both"/>
-      </w:pPr>
-      <w:r>
-        <w:t xml:space="preserve">ONYX </w:t>
-      </w:r>
-      <w:r>
-        <w:t xml:space="preserve">will be responsible for </w:t>
-      </w:r>
-      <w:r>
-        <w:t xml:space="preserve">its </w:t>
-      </w:r>
-      <w:r>
-        <w:t xml:space="preserve">property and casualty, general liability, and workers compensation insurance, taxes, professional training, and other personnel costs related to the operation of </w:t>
-      </w:r>
-      <w:r>
-        <w:t xml:space="preserve">its </w:t>
-      </w:r>
-      <w:r>
-        <w:t xml:space="preserve">business. </w:t>
-      </w:r>
-    </w:p>
-    <w:p>
-      <w:pPr>
-        <w:pStyle w:val="CLALTRNormal"/>
-        <w:jc w:val="both"/>
-      </w:pPr>
-      <w:r>
-        <w:t xml:space="preserve">When performing the services above, </w:t>
-      </w:r>
-      <w:r>
-        <w:t xml:space="preserve">ONYX </w:t>
-      </w:r>
-      <w:r>
-        <w:t xml:space="preserve">will utilize the resources available </w:t>
-      </w:r>
-      <w:r>
-        <w:t xml:space="preserve">from </w:t>
-      </w:r>
-      <w:r>
-        <w:t xml:space="preserve">the </w:t>
-      </w:r>
-      <w:r>
-        <w:t xml:space="preserve">Client </w:t>
-      </w:r>
-      <w:r>
-        <w:t xml:space="preserve">to the extent practical to continue development of </w:t>
-      </w:r>
-      <w:r>
-        <w:t xml:space="preserve">the Client’s </w:t>
-      </w:r>
-      <w:r>
-        <w:t xml:space="preserve">personnel. During a portion of </w:t>
-      </w:r>
-      <w:r>
-        <w:t xml:space="preserve">ONYX’s </w:t>
-      </w:r>
-      <w:r>
-        <w:t xml:space="preserve">work, </w:t>
-      </w:r>
-      <w:r>
-        <w:t xml:space="preserve">ONYX </w:t>
-      </w:r>
-      <w:r>
-        <w:t xml:space="preserve">may require the use of </w:t>
-      </w:r>
-      <w:r>
-        <w:t xml:space="preserve">the Client’s </w:t>
-      </w:r>
-      <w:r>
-        <w:t xml:space="preserve">computers. </w:t>
-      </w:r>
-      <w:r>
-        <w:t xml:space="preserve">ONYX </w:t>
-      </w:r>
-      <w:r>
-        <w:t>will try</w:t>
-      </w:r>
-      <w:r>
-        <w:t>, but does not guarantee,</w:t>
-      </w:r>
-      <w:r>
-        <w:t xml:space="preserve"> to give </w:t>
-      </w:r>
-      <w:r>
-        <w:t xml:space="preserve">the Client </w:t>
-      </w:r>
-      <w:r>
-        <w:t xml:space="preserve">advance notice and coordinate </w:t>
-      </w:r>
-      <w:r>
-        <w:t xml:space="preserve">its </w:t>
-      </w:r>
-      <w:r>
-        <w:t xml:space="preserve">use so it does not interfere with </w:t>
-      </w:r>
-      <w:r>
-        <w:t xml:space="preserve">the Client’s </w:t>
-      </w:r>
-      <w:r>
-        <w:t>employees.</w:t>
-      </w:r>
-    </w:p>
-    <w:p>
-      <w:pPr>
-        <w:pStyle w:val="CLALTRNormal"/>
-        <w:jc w:val="both"/>
-      </w:pPr>
-      <w:r>
-        <w:lastRenderedPageBreak/>
-        <w:t xml:space="preserve">The relationship of </w:t>
-      </w:r>
-      <w:r>
-        <w:t>ONYX</w:t>
-      </w:r>
-      <w:r>
-        <w:t xml:space="preserve"> </w:t>
-      </w:r>
-      <w:r>
-        <w:t>with the Client</w:t>
-      </w:r>
-      <w:r>
-        <w:t xml:space="preserve"> shall be solely that of an independent contractor</w:t>
-      </w:r>
-      <w:r>
-        <w:t>,</w:t>
-      </w:r>
-      <w:r>
-        <w:t xml:space="preserve"> and nothing in this agreement shall be construed to create or imply any relationship of employment, agency, partnership, or any relationship other than</w:t>
-      </w:r>
-      <w:r>
-        <w:t xml:space="preserve"> that of</w:t>
-      </w:r>
-      <w:r>
-        <w:t xml:space="preserve"> an independent contractor.</w:t>
-      </w:r>
-    </w:p>
-    <w:p>
-      <w:pPr>
-        <w:pStyle w:val="CLALTRNormal"/>
-        <w:jc w:val="both"/>
-      </w:pPr>
-      <w:r>
-        <w:t xml:space="preserve">Accounting standards and procedures will be suggested that are consistent with those normally utilized in an entity of the Client’s size and nature. ONYX will require the Client to approve any changes in the application of accounting standards and procedures for the Client. Internal controls may be recommended relating to the safeguarding of the Client’s assets. If fraud is initiated by the Client’s employees or other service providers, any resulting losses shall be the Client’s responsibility, and the Client shall look first to its own insurance coverage.</w:t>
-      </w:r>
-    </w:p>
-    <w:p>
-      <w:pPr>
-        <w:pStyle w:val="CLALTRNormal"/>
-        <w:jc w:val="both"/>
-      </w:pPr>
-      <w:r>
-        <w:t xml:space="preserve">The </w:t>
-      </w:r>
-      <w:r>
-        <w:t xml:space="preserve">Client </w:t>
-      </w:r>
-      <w:r>
-        <w:t xml:space="preserve">agrees that </w:t>
-      </w:r>
-      <w:r>
-        <w:t>ONYX</w:t>
-      </w:r>
-      <w:r>
-        <w:t xml:space="preserve"> will not be assuming any fiduciary responsibility on </w:t>
-      </w:r>
-      <w:r>
-        <w:t xml:space="preserve">the Client’s </w:t>
-      </w:r>
-      <w:r>
-        <w:t xml:space="preserve">behalf </w:t>
-      </w:r>
-      <w:proofErr w:type="gramStart"/>
-      <w:r>
-        <w:t>during the course of</w:t>
-      </w:r>
-      <w:proofErr w:type="gramEnd"/>
-      <w:r>
-        <w:t xml:space="preserve"> this engagement.</w:t>
-      </w:r>
-    </w:p>
-    <w:p>
-      <w:pPr>
-        <w:pStyle w:val="CLALTRNormal"/>
-        <w:jc w:val="both"/>
-      </w:pPr>
-      <w:r>
-        <w:t xml:space="preserve">The Client agrees that ONYX may communicate with the Client and its representatives (if the Client is a business entity) via electronic mail (“E-mail”) and text. The Client understands that ONYX will not encrypt or otherwise protect from interception and/or review by others E-mail </w:t>
-      </w:r>
-      <w:r>
-        <w:t>and text communications to and from the Client and ONYX unless the Client makes special arrangements with ONYX to do so. The Client consents to such communications.</w:t>
-      </w:r>
-    </w:p>
-    <w:p>
-      <w:pPr>
-        <w:pStyle w:val="CLALTRNormal"/>
-        <w:jc w:val="both"/>
-      </w:pPr>
-      <w:r>
-        <w:t>Each natural person who signs this letter in his or her individual capacity as a natural person or as a guarantor agrees to be jointly and severally liable with each other person signing this letter for the payment of ONYX’s fees and costs and personally guarantees the same. This provision does NOT apply to any natural person that signs this letter on behalf of any business entity other than a general partnership, unless the manner of signing shows that natural person’s intent to be bound individually or as a guarantor.</w:t>
-      </w:r>
-    </w:p>
-    <w:p>
-      <w:pPr>
-        <w:pStyle w:val="CLALTRNormal"/>
-        <w:jc w:val="both"/>
-      </w:pPr>
-      <w:r>
-        <w:t xml:space="preserve">Each person that signs this letter on behalf of any Client that is a business entity, by doing so, personally represents and warrants </w:t>
-      </w:r>
-      <w:r>
-        <w:t>to ONYX that he, she, or it has all requisite power and authority to engage ONYX and bind the business entity Client to the terms of this letter and that the Client on whose behalf the letter is signed has/have duly taken all necessary and proper corporate or other actions to engage ONYX pursuant to the terms of this letter.</w:t>
-      </w:r>
-    </w:p>
-    <w:p>
-      <w:pPr>
-        <w:pStyle w:val="CLALTRNormal"/>
-        <w:jc w:val="both"/>
-      </w:pPr>
-      <w:r>
-        <w:rPr>
-          <w:b/>
-        </w:rPr>
-        <w:t xml:space="preserve">Record retention.  </w:t>
-      </w:r>
-      <w:r>
-        <w:t xml:space="preserve">ONYX will retain its working papers, supporting schedules, and other documentation prepared in connection with this engagement for a period of seven (7) years from the completion of the applicable services, after which ONYX may destroy or otherwise dispose of such records without further notice to the Client. Working papers and other documents prepared by ONYX in the course of the engagement remain the property of ONYX. Original records, source documents, and other materials furnished by the Client remain the property of the Client and will be returned upon written request. The Client is responsible for maintaining its own copies of its records and for meeting its own record-retention obligations. ONYX has no obligation to retain any records or data beyond the seven (7) year period and may maintain such records in electronic form.</w:t>
-      </w:r>
-    </w:p>
-    <w:p>
-      <w:pPr>
-        <w:pStyle w:val="CLALTRHeading1"/>
-        <w:jc w:val="both"/>
-      </w:pPr>
-      <w:r>
-        <w:t>Employment provision</w:t>
-      </w:r>
-    </w:p>
-    <w:p>
-      <w:pPr>
-        <w:pStyle w:val="CLALTRNormal"/>
-        <w:jc w:val="both"/>
-      </w:pPr>
-      <w:proofErr w:type="gramStart"/>
-      <w:r>
-        <w:t>In the event that</w:t>
-      </w:r>
-      <w:proofErr w:type="gramEnd"/>
-      <w:r>
-        <w:t xml:space="preserve"> a</w:t>
-      </w:r>
-      <w:r>
-        <w:t>n</w:t>
-      </w:r>
-      <w:r>
-        <w:t xml:space="preserve"> </w:t>
-      </w:r>
-      <w:r>
-        <w:t>ONYX</w:t>
-      </w:r>
-      <w:r>
         <w:t xml:space="preserve"> employee is solicited to work in a position as an employee of the </w:t>
       </w:r>
       <w:r>
         <w:t>Client</w:t>
       </w:r>
       <w:r>
-        <w:t xml:space="preserve">, and </w:t>
-      </w:r>
-      <w:proofErr w:type="gramStart"/>
-      <w:r>
-        <w:t>in the event that</w:t>
-      </w:r>
-      <w:proofErr w:type="gramEnd"/>
-      <w:r>
-        <w:t xml:space="preserve"> the </w:t>
+        <w:t xml:space="preserve">, and in the event that the </w:t>
       </w:r>
       <w:r>
         <w:t>ONYX</w:t>
@@ -3396,15 +3095,7 @@
         <w:t>ONYX</w:t>
       </w:r>
       <w:r>
-        <w:t xml:space="preserve"> will require a four-week notice period </w:t>
-      </w:r>
-      <w:proofErr w:type="gramStart"/>
-      <w:r>
-        <w:t>subsequent to</w:t>
-      </w:r>
-      <w:proofErr w:type="gramEnd"/>
-      <w:r>
-        <w:t xml:space="preserve"> the employee’s written notice to </w:t>
+        <w:t xml:space="preserve"> will require a four-week notice period subsequent to the employee’s written notice to </w:t>
       </w:r>
       <w:r>
         <w:t>ONYX</w:t>
@@ -3432,7 +3123,6 @@
         <w:t xml:space="preserve">will be required to pay an employment fee of </w:t>
       </w:r>
       <w:r>
-        <w:rPr/>
         <w:t>$200,000 for the CFO, $150,000 for the controller, and $100,000 for the staff</w:t>
       </w:r>
       <w:r>
@@ -3460,13 +3150,8 @@
         <w:t xml:space="preserve"> employee shall be hired as an employee</w:t>
       </w:r>
       <w:r>
-        <w:t xml:space="preserve"> of the </w:t>
-      </w:r>
-      <w:proofErr w:type="spellStart"/>
-      <w:r>
-        <w:t>Client</w:t>
-      </w:r>
-      <w:proofErr w:type="spellEnd"/>
+        <w:t xml:space="preserve"> of the Client</w:t>
+      </w:r>
       <w:r>
         <w:t xml:space="preserve"> within</w:t>
       </w:r>
@@ -3515,6 +3200,12 @@
       <w:r>
         <w:t>.</w:t>
       </w:r>
+    </w:p>
+    <w:p>
+      <w:pPr>
+        <w:pStyle w:val="CLALTRHeading1"/>
+        <w:jc w:val="both"/>
+      </w:pPr>
     </w:p>
     <w:p>
       <w:pPr>
@@ -3530,10 +3221,8 @@
       <w:pPr>
         <w:pStyle w:val="CLALTRHeading2"/>
         <w:jc w:val="both"/>
-        <w:rPr/>
-      </w:pPr>
-      <w:r>
-        <w:rPr/>
+      </w:pPr>
+      <w:r>
         <w:t>Subcontractors</w:t>
       </w:r>
       <w:r>
@@ -3549,43 +3238,33 @@
         <w:jc w:val="both"/>
       </w:pPr>
       <w:r>
-        <w:rPr/>
         <w:t>ONYX</w:t>
       </w:r>
       <w:r>
-        <w:rPr/>
         <w:t xml:space="preserve"> may, at times, use subcontractors to perform services under this agreement, and </w:t>
       </w:r>
       <w:r>
-        <w:rPr/>
         <w:t>said subcontractors</w:t>
       </w:r>
       <w:r>
-        <w:rPr/>
         <w:t xml:space="preserve"> </w:t>
       </w:r>
       <w:r>
-        <w:rPr/>
         <w:t xml:space="preserve">may have access to </w:t>
       </w:r>
       <w:r>
-        <w:rPr/>
         <w:t>the Client’s</w:t>
       </w:r>
       <w:r>
-        <w:rPr/>
         <w:t xml:space="preserve"> </w:t>
       </w:r>
       <w:r>
-        <w:rPr/>
         <w:t xml:space="preserve">information and records. Any such subcontractors will be subject to the same restrictions on the use of such information and records as apply to </w:t>
       </w:r>
       <w:r>
-        <w:rPr/>
         <w:t>ONYX</w:t>
       </w:r>
       <w:r>
-        <w:rPr/>
         <w:t xml:space="preserve"> under this agreement.</w:t>
       </w:r>
     </w:p>
@@ -3604,43 +3283,46 @@
         <w:jc w:val="both"/>
       </w:pPr>
       <w:r>
-        <w:t xml:space="preserve">ONYX may use third-party software, cloud-based platforms, and advanced technologies, including automated data processing and artificial intelligence tools, to assist in delivering services under this agreement. The Client acknowledges and authorizes ONYX to share and process the Client’s data with such providers as necessary to perform the services. These providers may have access to the Client’s data solely for the purpose of supporting ONYX’s service delivery. ONYX uses commercially reasonable efforts to select and maintain service providers with appropriate data security and confidentiality standards.</w:t>
-      </w:r>
-    </w:p>
-    <w:p>
-      <w:pPr>
-        <w:pStyle w:val="CLALTRNormal"/>
-        <w:jc w:val="both"/>
-      </w:pPr>
-      <w:r>
-        <w:t xml:space="preserve">The Client authorizes ONYX to sign on the Client’s behalf any vendor agreements applicable to such software applications, and ONYX shall provide a copy of the application agreement at the Client’s request.</w:t>
-      </w:r>
-    </w:p>
-    <w:p>
-      <w:pPr>
-        <w:pStyle w:val="CLALTRNormal"/>
-        <w:jc w:val="both"/>
-      </w:pPr>
-      <w:r>
-        <w:t xml:space="preserve">Client acknowledges that ONYX may access Client’s accounting systems, banking platforms, payroll systems, software applications, cloud-based services, and other technology systems as reasonably necessary to perform the services described in this agreement. Client shall remain solely responsible for maintaining the security of its systems, credentials, access permissions, authentication controls, network infrastructure, and data.</w:t>
-      </w:r>
-    </w:p>
-    <w:p>
-      <w:pPr>
-        <w:pStyle w:val="CLALTRNormal"/>
-        <w:jc w:val="both"/>
-      </w:pPr>
-      <w:r>
-        <w:t xml:space="preserve">Client acknowledges that cyber incidents, phishing attacks, social engineering events, credential compromise, malware, ransomware, unauthorized access, and failures of third-party technology providers may occur despite reasonable safeguards. Except to the extent resulting from ONYX’s gross negligence or willful misconduct, ONYX shall not be responsible for any loss, theft, alteration, corruption, disclosure, or unauthorized access to Client data, funds, systems, or information arising from such events.</w:t>
-      </w:r>
-    </w:p>
-    <w:p>
-      <w:pPr>
-        <w:pStyle w:val="CLALTRNormal"/>
-        <w:jc w:val="both"/>
-      </w:pPr>
-      <w:r>
-        <w:t xml:space="preserve">Client further acknowledges that ONYX may rely upon electronic communications, system credentials, approvals, instructions, and authorizations reasonably believed by ONYX to have originated from authorized Client representatives, and ONYX shall have no liability for actions taken in reasonable reliance upon such communications or instructions.</w:t>
+        <w:t xml:space="preserve">ONYX may use third-party software, cloud-based platforms, and advanced technologies, including automated data processing and artificial intelligence tools, to assist in delivering services under this agreement. The Client acknowledges and authorizes ONYX to share and process the Client’s data with such providers as necessary to perform the services. These providers may have access to the Client’s data solely for the purpose of supporting ONYX’s service delivery. ONYX uses commercially reasonable efforts to </w:t>
+      </w:r>
+      <w:r>
+        <w:t>select and maintain service providers with appropriate data security and confidentiality standards.</w:t>
+      </w:r>
+    </w:p>
+    <w:p>
+      <w:pPr>
+        <w:pStyle w:val="CLALTRNormal"/>
+        <w:jc w:val="both"/>
+      </w:pPr>
+      <w:r>
+        <w:t>The Client authorizes ONYX to sign on the Client’s behalf any vendor agreements applicable to such software applications, and ONYX shall provide a copy of the application agreement at the Client’s request.</w:t>
+      </w:r>
+    </w:p>
+    <w:p>
+      <w:pPr>
+        <w:pStyle w:val="CLALTRNormal"/>
+        <w:jc w:val="both"/>
+      </w:pPr>
+      <w:r>
+        <w:t>Client acknowledges that ONYX may access Client’s accounting systems, banking platforms, payroll systems, software applications, cloud-based services, and other technology systems as reasonably necessary to perform the services described in this agreement. Client shall remain solely responsible for maintaining the security of its systems, credentials, access permissions, authentication controls, network infrastructure, and data.</w:t>
+      </w:r>
+    </w:p>
+    <w:p>
+      <w:pPr>
+        <w:pStyle w:val="CLALTRNormal"/>
+        <w:jc w:val="both"/>
+      </w:pPr>
+      <w:r>
+        <w:t>Client acknowledges that cyber incidents, phishing attacks, social engineering events, credential compromise, malware, ransomware, unauthorized access, and failures of third-party technology providers may occur despite reasonable safeguards. Except to the extent resulting from ONYX’s gross negligence or willful misconduct, ONYX shall not be responsible for any loss, theft, alteration, corruption, disclosure, or unauthorized access to Client data, funds, systems, or information arising from such events.</w:t>
+      </w:r>
+    </w:p>
+    <w:p>
+      <w:pPr>
+        <w:pStyle w:val="CLALTRNormal"/>
+        <w:jc w:val="both"/>
+      </w:pPr>
+      <w:r>
+        <w:t>Client further acknowledges that ONYX may rely upon electronic communications, system credentials, approvals, instructions, and authorizations reasonably believed by ONYX to have originated from authorized Client representatives, and ONYX shall have no liability for actions taken in reasonable reliance upon such communications or instructions.</w:t>
       </w:r>
     </w:p>
     <w:p>
@@ -3648,7 +3330,62 @@
         <w:pStyle w:val="CLALTRHeading1"/>
         <w:jc w:val="both"/>
       </w:pPr>
-      <w:r>
+    </w:p>
+    <w:p>
+      <w:pPr>
+        <w:pStyle w:val="CLALTRHeading1"/>
+        <w:jc w:val="both"/>
+      </w:pPr>
+    </w:p>
+    <w:p>
+      <w:pPr>
+        <w:pStyle w:val="CLALTRHeading1"/>
+        <w:jc w:val="both"/>
+      </w:pPr>
+    </w:p>
+    <w:p>
+      <w:pPr>
+        <w:pStyle w:val="CLALTRHeading1"/>
+        <w:jc w:val="both"/>
+      </w:pPr>
+    </w:p>
+    <w:p>
+      <w:pPr>
+        <w:pStyle w:val="CLALTRHeading1"/>
+        <w:jc w:val="both"/>
+      </w:pPr>
+    </w:p>
+    <w:p>
+      <w:pPr>
+        <w:pStyle w:val="CLALTRHeading1"/>
+        <w:jc w:val="both"/>
+      </w:pPr>
+    </w:p>
+    <w:p>
+      <w:pPr>
+        <w:pStyle w:val="CLALTRHeading1"/>
+        <w:jc w:val="both"/>
+      </w:pPr>
+    </w:p>
+    <w:p>
+      <w:pPr>
+        <w:pStyle w:val="CLALTRHeading1"/>
+        <w:jc w:val="both"/>
+      </w:pPr>
+    </w:p>
+    <w:p>
+      <w:pPr>
+        <w:pStyle w:val="CLALTRHeading1"/>
+        <w:jc w:val="both"/>
+      </w:pPr>
+    </w:p>
+    <w:p>
+      <w:pPr>
+        <w:pStyle w:val="CLALTRHeading1"/>
+        <w:jc w:val="both"/>
+      </w:pPr>
+      <w:r>
+        <w:lastRenderedPageBreak/>
         <w:t>Agreement</w:t>
       </w:r>
     </w:p>
@@ -3797,53 +3534,7 @@
       <w:pPr>
         <w:pStyle w:val="CLALTRHeading1"/>
       </w:pPr>
-    </w:p>
-    <w:p>
-      <w:pPr>
-        <w:pStyle w:val="CLALTRHeading1"/>
-      </w:pPr>
-    </w:p>
-    <w:p>
-      <w:pPr>
-        <w:pStyle w:val="CLALTRHeading1"/>
-      </w:pPr>
-    </w:p>
-    <w:p>
-      <w:pPr>
-        <w:pStyle w:val="CLALTRHeading1"/>
-      </w:pPr>
-    </w:p>
-    <w:p>
-      <w:pPr>
-        <w:pStyle w:val="CLALTRHeading1"/>
-      </w:pPr>
-    </w:p>
-    <w:p>
-      <w:pPr>
-        <w:pStyle w:val="CLALTRHeading1"/>
-      </w:pPr>
-    </w:p>
-    <w:p>
-      <w:pPr>
-        <w:pStyle w:val="CLALTRHeading1"/>
-      </w:pPr>
-    </w:p>
-    <w:p>
-      <w:pPr>
-        <w:pStyle w:val="CLALTRHeading1"/>
-      </w:pPr>
-    </w:p>
-    <w:p>
-      <w:pPr>
-        <w:pStyle w:val="CLALTRHeading1"/>
-      </w:pPr>
-    </w:p>
-    <w:p>
-      <w:pPr>
-        <w:pStyle w:val="CLALTRHeading1"/>
-      </w:pPr>
-      <w:r>
-        <w:lastRenderedPageBreak/>
+      <w:r>
         <w:t>Response:</w:t>
       </w:r>
     </w:p>
@@ -3858,7 +3549,7 @@
         <w:rPr>
           <w:noProof/>
         </w:rPr>
-        <w:t>AJAC, Inc. d/b/a George Brazil</w:t>
+        <w:t>AJAC, Inc. dba George Brazil</w:t>
       </w:r>
       <w:r>
         <w:t>.</w:t>
@@ -4349,22 +4040,7 @@
       <w:pStyle w:val="CLALTRHeaderorFooter"/>
     </w:pPr>
     <w:r>
-      <w:fldChar w:fldCharType="begin"/>
-    </w:r>
-    <w:r>
-      <w:instrText xml:space="preserve">MACROBUTTON NoMacro [Click </w:instrText>
-    </w:r>
-    <w:r>
-      <w:rPr>
-        <w:b/>
-      </w:rPr>
-      <w:instrText>here</w:instrText>
-    </w:r>
-    <w:r>
-      <w:instrText xml:space="preserve"> and type date]</w:instrText>
-    </w:r>
-    <w:r>
-      <w:fldChar w:fldCharType="end"/>
+      <w:t>October 5, 2026</w:t>
     </w:r>
   </w:p>
   <w:p>
@@ -4372,22 +4048,7 @@
       <w:pStyle w:val="CLALTRHeaderorFooter"/>
     </w:pPr>
     <w:r>
-      <w:fldChar w:fldCharType="begin"/>
-    </w:r>
-    <w:r>
-      <w:instrText xml:space="preserve">MACROBUTTON NoMacro [Click </w:instrText>
-    </w:r>
-    <w:r>
-      <w:rPr>
-        <w:b/>
-      </w:rPr>
-      <w:instrText>here</w:instrText>
-    </w:r>
-    <w:r>
-      <w:instrText xml:space="preserve"> and type organization]</w:instrText>
-    </w:r>
-    <w:r>
-      <w:fldChar w:fldCharType="end"/>
+      <w:t>AJAC, Inc. dba George Brazil</w:t>
     </w:r>
   </w:p>
   <w:p>

</xml_diff>